<commit_message>
Updating documentation to include specifications required to run the system
</commit_message>
<xml_diff>
--- a/TR-017_System_Tuning.docx
+++ b/TR-017_System_Tuning.docx
@@ -1,6 +1,6 @@
 
 <file path=word/document.xml><?xml version="1.0" encoding="utf-8"?>
-<w:document xmlns:wpc="http://schemas.microsoft.com/office/word/2010/wordprocessingCanvas" xmlns:cx="http://schemas.microsoft.com/office/drawing/2014/chartex" xmlns:cx1="http://schemas.microsoft.com/office/drawing/2015/9/8/chartex" xmlns:cx2="http://schemas.microsoft.com/office/drawing/2015/10/21/chartex" xmlns:cx3="http://schemas.microsoft.com/office/drawing/2016/5/9/chartex" xmlns:cx4="http://schemas.microsoft.com/office/drawing/2016/5/10/chartex" xmlns:cx5="http://schemas.microsoft.com/office/drawing/2016/5/11/chartex" xmlns:cx6="http://schemas.microsoft.com/office/drawing/2016/5/12/chartex" xmlns:cx7="http://schemas.microsoft.com/office/drawing/2016/5/13/chartex" xmlns:cx8="http://schemas.microsoft.com/office/drawing/2016/5/14/chartex" xmlns:mc="http://schemas.openxmlformats.org/markup-compatibility/2006" xmlns:aink="http://schemas.microsoft.com/office/drawing/2016/ink" xmlns:am3d="http://schemas.microsoft.com/office/drawing/2017/model3d" xmlns:o="urn:schemas-microsoft-com:office:office" xmlns:oel="http://schemas.microsoft.com/office/2019/extlst" xmlns:r="http://schemas.openxmlformats.org/officeDocument/2006/relationships" xmlns:m="http://schemas.openxmlformats.org/officeDocument/2006/math" xmlns:v="urn:schemas-microsoft-com:vml" xmlns:wp14="http://schemas.microsoft.com/office/word/2010/wordprocessingDrawing" xmlns:wp="http://schemas.openxmlformats.org/drawingml/2006/wordprocessingDrawing" xmlns:w10="urn:schemas-microsoft-com:office:word" xmlns:w="http://schemas.openxmlformats.org/wordprocessingml/2006/main" xmlns:w14="http://schemas.microsoft.com/office/word/2010/wordml" xmlns:w15="http://schemas.microsoft.com/office/word/2012/wordml" xmlns:w16cex="http://schemas.microsoft.com/office/word/2018/wordml/cex" xmlns:w16cid="http://schemas.microsoft.com/office/word/2016/wordml/cid" xmlns:w16="http://schemas.microsoft.com/office/word/2018/wordml" xmlns:w16du="http://schemas.microsoft.com/office/word/2023/wordml/word16du" xmlns:w16sdtdh="http://schemas.microsoft.com/office/word/2020/wordml/sdtdatahash" xmlns:w16sdtfl="http://schemas.microsoft.com/office/word/2024/wordml/sdtformatlock" xmlns:w16se="http://schemas.microsoft.com/office/word/2015/wordml/symex" xmlns:wpg="http://schemas.microsoft.com/office/word/2010/wordprocessingGroup" xmlns:wpi="http://schemas.microsoft.com/office/word/2010/wordprocessingInk" xmlns:wne="http://schemas.microsoft.com/office/word/2006/wordml" xmlns:wps="http://schemas.microsoft.com/office/word/2010/wordprocessingShape" mc:Ignorable="w14 w15 w16se w16cid w16 w16cex w16sdtdh w16sdtfl w16du wp14">
+<w:document xmlns:wpc="http://schemas.microsoft.com/office/word/2010/wordprocessingCanvas" xmlns:cx="http://schemas.microsoft.com/office/drawing/2014/chartex" xmlns:cx1="http://schemas.microsoft.com/office/drawing/2015/9/8/chartex" xmlns:cx2="http://schemas.microsoft.com/office/drawing/2015/10/21/chartex" xmlns:cx3="http://schemas.microsoft.com/office/drawing/2016/5/9/chartex" xmlns:cx4="http://schemas.microsoft.com/office/drawing/2016/5/10/chartex" xmlns:cx5="http://schemas.microsoft.com/office/drawing/2016/5/11/chartex" xmlns:cx6="http://schemas.microsoft.com/office/drawing/2016/5/12/chartex" xmlns:cx7="http://schemas.microsoft.com/office/drawing/2016/5/13/chartex" xmlns:cx8="http://schemas.microsoft.com/office/drawing/2016/5/14/chartex" xmlns:mc="http://schemas.openxmlformats.org/markup-compatibility/2006" xmlns:aink="http://schemas.microsoft.com/office/drawing/2016/ink" xmlns:am3d="http://schemas.microsoft.com/office/drawing/2017/model3d" xmlns:o="urn:schemas-microsoft-com:office:office" xmlns:oel="http://schemas.microsoft.com/office/2019/extlst" xmlns:r="http://schemas.openxmlformats.org/officeDocument/2006/relationships" xmlns:m="http://schemas.openxmlformats.org/officeDocument/2006/math" xmlns:v="urn:schemas-microsoft-com:vml" xmlns:wp14="http://schemas.microsoft.com/office/word/2010/wordprocessingDrawing" xmlns:wp="http://schemas.openxmlformats.org/drawingml/2006/wordprocessingDrawing" xmlns:w10="urn:schemas-microsoft-com:office:word" xmlns:w="http://schemas.openxmlformats.org/wordprocessingml/2006/main" xmlns:w14="http://schemas.microsoft.com/office/word/2010/wordml" xmlns:w15="http://schemas.microsoft.com/office/word/2012/wordml" xmlns:w16cei="http://schemas.microsoft.com/office/word/2026/wordml/cei" xmlns:w16cex="http://schemas.microsoft.com/office/word/2018/wordml/cex" xmlns:w16cid="http://schemas.microsoft.com/office/word/2016/wordml/cid" xmlns:w16="http://schemas.microsoft.com/office/word/2018/wordml" xmlns:w16du="http://schemas.microsoft.com/office/word/2023/wordml/word16du" xmlns:w16sdtdh="http://schemas.microsoft.com/office/word/2020/wordml/sdtdatahash" xmlns:w16sdtfl="http://schemas.microsoft.com/office/word/2024/wordml/sdtformatlock" xmlns:w16se="http://schemas.microsoft.com/office/word/2015/wordml/symex" xmlns:wpg="http://schemas.microsoft.com/office/word/2010/wordprocessingGroup" xmlns:wpi="http://schemas.microsoft.com/office/word/2010/wordprocessingInk" xmlns:wne="http://schemas.microsoft.com/office/word/2006/wordml" xmlns:wps="http://schemas.microsoft.com/office/word/2010/wordprocessingShape" mc:Ignorable="w14 w15 w16se w16cid w16 w16cex w16sdtdh w16sdtfl w16du wp14">
   <w:body>
     <w:p>
       <w:pPr>
@@ -21,6 +21,329 @@
         <w:pStyle w:val="Heading1"/>
       </w:pPr>
       <w:r>
+        <w:t>Sufficient hardware</w:t>
+      </w:r>
+    </w:p>
+    <w:p>
+      <w:r>
+        <w:t>Achieving full-rate capture, replay, and rendering requires high-performance hardware systems. The following systems were found to be sufficient:</w:t>
+      </w:r>
+    </w:p>
+    <w:p>
+      <w:pPr>
+        <w:pStyle w:val="ListParagraph"/>
+        <w:numPr>
+          <w:ilvl w:val="0"/>
+          <w:numId w:val="14"/>
+        </w:numPr>
+      </w:pPr>
+      <w:r>
+        <w:rPr>
+          <w:b/>
+          <w:bCs/>
+        </w:rPr>
+        <w:t>Rendering:</w:t>
+      </w:r>
+    </w:p>
+    <w:p>
+      <w:pPr>
+        <w:pStyle w:val="ListParagraph"/>
+        <w:numPr>
+          <w:ilvl w:val="1"/>
+          <w:numId w:val="14"/>
+        </w:numPr>
+      </w:pPr>
+      <w:r>
+        <w:rPr>
+          <w:b/>
+          <w:bCs/>
+        </w:rPr>
+        <w:t>Development</w:t>
+      </w:r>
+      <w:r>
+        <w:rPr>
+          <w:b/>
+          <w:bCs/>
+        </w:rPr>
+        <w:t xml:space="preserve"> laptop</w:t>
+      </w:r>
+      <w:r>
+        <w:rPr>
+          <w:b/>
+          <w:bCs/>
+        </w:rPr>
+        <w:t>:</w:t>
+      </w:r>
+      <w:r>
+        <w:t xml:space="preserve"> Using a local copy of the </w:t>
+      </w:r>
+      <w:r>
+        <w:rPr>
+          <w:b/>
+          <w:bCs/>
+          <w:i/>
+          <w:iCs/>
+        </w:rPr>
+        <w:t xml:space="preserve">Core Module using the </w:t>
+      </w:r>
+      <w:r>
+        <w:rPr>
+          <w:b/>
+          <w:bCs/>
+          <w:i/>
+          <w:iCs/>
+        </w:rPr>
+        <w:t>Camera Simulator</w:t>
+      </w:r>
+      <w:r>
+        <w:t xml:space="preserve"> running on localhost and talking to the Render Module, an </w:t>
+      </w:r>
+      <w:r>
+        <w:t>Alienware m18 R1</w:t>
+      </w:r>
+      <w:r>
+        <w:t xml:space="preserve"> laptop with a </w:t>
+      </w:r>
+      <w:r>
+        <w:t>13th Gen Intel(R) Core(TM) i9-13900HX</w:t>
+      </w:r>
+      <w:r>
+        <w:t xml:space="preserve">, 32GB of RAM, and an </w:t>
+      </w:r>
+      <w:r>
+        <w:t>NVIDIA GeForce RTX 4080 Laptop GPU (12 GB)</w:t>
+      </w:r>
+      <w:r>
+        <w:t xml:space="preserve"> </w:t>
+      </w:r>
+      <w:r>
+        <w:t>is</w:t>
+      </w:r>
+      <w:r>
+        <w:t xml:space="preserve"> usually able to smoothly display 21 cameras</w:t>
+      </w:r>
+      <w:r>
+        <w:t xml:space="preserve"> (under Linux or Windows)</w:t>
+      </w:r>
+      <w:r>
+        <w:t>. This require</w:t>
+      </w:r>
+      <w:r>
+        <w:t>s</w:t>
+      </w:r>
+      <w:r>
+        <w:t xml:space="preserve"> the DisplayWindow to have focus and sometimes require</w:t>
+      </w:r>
+      <w:r>
+        <w:t>s</w:t>
+      </w:r>
+      <w:r>
+        <w:t xml:space="preserve"> one or two restarts of the Render Module.</w:t>
+      </w:r>
+      <w:r>
+        <w:t xml:space="preserve"> This system can </w:t>
+      </w:r>
+      <w:r>
+        <w:rPr>
+          <w:i/>
+          <w:iCs/>
+        </w:rPr>
+        <w:t>very slowly</w:t>
+      </w:r>
+      <w:r>
+        <w:t xml:space="preserve"> (because of insufficient disk speed) run the </w:t>
+      </w:r>
+      <w:r>
+        <w:rPr>
+          <w:b/>
+          <w:bCs/>
+          <w:i/>
+          <w:iCs/>
+        </w:rPr>
+        <w:t>Storage Module</w:t>
+      </w:r>
+      <w:r>
+        <w:t xml:space="preserve"> talking via localhost to a Render Module, using the pause function (space bar) often to let the storage catch up.</w:t>
+      </w:r>
+    </w:p>
+    <w:p>
+      <w:pPr>
+        <w:pStyle w:val="ListParagraph"/>
+        <w:numPr>
+          <w:ilvl w:val="1"/>
+          <w:numId w:val="14"/>
+        </w:numPr>
+      </w:pPr>
+      <w:r>
+        <w:rPr>
+          <w:b/>
+          <w:bCs/>
+        </w:rPr>
+        <w:t>Deployment laptop:</w:t>
+      </w:r>
+      <w:r>
+        <w:t xml:space="preserve"> </w:t>
+      </w:r>
+      <w:r>
+        <w:t xml:space="preserve">An Alienware 18 Area-51 laptop with an </w:t>
+      </w:r>
+      <w:r>
+        <w:t>NVIDIA GeForce RTX 5090 24 GB</w:t>
+      </w:r>
+      <w:r>
+        <w:t xml:space="preserve"> and two </w:t>
+      </w:r>
+      <w:r>
+        <w:t>Crucial 4TB T500 PCIe 4.0 x4 M.2 Internal SSD</w:t>
+      </w:r>
+      <w:r>
+        <w:t xml:space="preserve">s can run </w:t>
+      </w:r>
+      <w:r>
+        <w:rPr>
+          <w:b/>
+          <w:bCs/>
+          <w:i/>
+          <w:iCs/>
+        </w:rPr>
+        <w:t>Storage Module</w:t>
+      </w:r>
+      <w:r>
+        <w:t xml:space="preserve"> at full rate locally writing to a Render Module at full rate from a 21-camera recording. This can display to the local display </w:t>
+      </w:r>
+      <w:r>
+        <w:t xml:space="preserve">and </w:t>
+      </w:r>
+      <w:r>
+        <w:t>to an Elbit XSight HMD.</w:t>
+      </w:r>
+      <w:r>
+        <w:t xml:space="preserve"> This is much smaller and lighter than the deskside Render Server used as the primary development platform.</w:t>
+      </w:r>
+      <w:r>
+        <w:t xml:space="preserve"> It is also capable of doing depth estimation on a 25-camera system, but the speed of this is still being studied. Using these drives, it can store from a 21-camera live system at full rate until the drives are approximately halfway full; we’re still investigating the use of commercial-grade drives to enable full-speed storage to full drive capacity.</w:t>
+      </w:r>
+      <w:r>
+        <w:t xml:space="preserve"> Using an </w:t>
+      </w:r>
+      <w:r>
+        <w:t>ATTO Technology ThunderLink NS 5102</w:t>
+      </w:r>
+      <w:r>
+        <w:t xml:space="preserve"> </w:t>
+      </w:r>
+      <w:r>
+        <w:t>Thunderbolt 5 to 100Gb Ethernet Adapter</w:t>
+      </w:r>
+      <w:r>
+        <w:t xml:space="preserve">, the system </w:t>
+      </w:r>
+      <w:r>
+        <w:t>can</w:t>
+      </w:r>
+      <w:r>
+        <w:t xml:space="preserve"> </w:t>
+      </w:r>
+      <w:r>
+        <w:rPr>
+          <w:b/>
+          <w:bCs/>
+          <w:i/>
+          <w:iCs/>
+        </w:rPr>
+        <w:t>stream and display live data</w:t>
+      </w:r>
+      <w:r>
+        <w:t xml:space="preserve"> from a 21-camera system or played back from a remote Storage Module under Linux (the Windows networking stack does not allow full-rate operation).</w:t>
+      </w:r>
+      <w:r>
+        <w:t xml:space="preserve"> </w:t>
+      </w:r>
+      <w:r>
+        <w:t>This can</w:t>
+      </w:r>
+      <w:r>
+        <w:t xml:space="preserve"> </w:t>
+      </w:r>
+      <w:r>
+        <w:t xml:space="preserve">also </w:t>
+      </w:r>
+      <w:r>
+        <w:t>drive both a local display and an XSight.</w:t>
+      </w:r>
+    </w:p>
+    <w:p>
+      <w:pPr>
+        <w:pStyle w:val="ListParagraph"/>
+        <w:numPr>
+          <w:ilvl w:val="1"/>
+          <w:numId w:val="14"/>
+        </w:numPr>
+      </w:pPr>
+      <w:r>
+        <w:rPr>
+          <w:b/>
+          <w:bCs/>
+        </w:rPr>
+        <w:t>Development desk-sides:</w:t>
+      </w:r>
+      <w:r>
+        <w:t xml:space="preserve"> The main development computers were large desk-side systems custom built for the project.</w:t>
+      </w:r>
+      <w:r>
+        <w:t xml:space="preserve"> Both use a Mellanox PCI 100GigE network connector with two SFP modules.</w:t>
+      </w:r>
+      <w:r>
+        <w:t xml:space="preserve"> The </w:t>
+      </w:r>
+      <w:r>
+        <w:rPr>
+          <w:b/>
+          <w:bCs/>
+          <w:i/>
+          <w:iCs/>
+        </w:rPr>
+        <w:t xml:space="preserve">Storage </w:t>
+      </w:r>
+      <w:r>
+        <w:rPr>
+          <w:b/>
+          <w:bCs/>
+          <w:i/>
+          <w:iCs/>
+        </w:rPr>
+        <w:t>Server</w:t>
+      </w:r>
+      <w:r>
+        <w:t xml:space="preserve"> </w:t>
+      </w:r>
+      <w:r>
+        <w:t>includes a PCI four 2-TB NVMe drive enclosure with commercial-grade cards, supporting up to half an hour of full-rate capture on a 21-camera ball.</w:t>
+      </w:r>
+      <w:r>
+        <w:t xml:space="preserve"> The </w:t>
+      </w:r>
+      <w:r>
+        <w:rPr>
+          <w:b/>
+          <w:bCs/>
+          <w:i/>
+          <w:iCs/>
+        </w:rPr>
+        <w:t>Render Server</w:t>
+      </w:r>
+      <w:r>
+        <w:t xml:space="preserve"> includes an NVIDIA GeForce RTX 4090 with 24GB.</w:t>
+      </w:r>
+      <w:r>
+        <w:t xml:space="preserve"> It also includes the Thunderbolt ports required to connect to a Varjo XR-4 HMD.</w:t>
+      </w:r>
+    </w:p>
+    <w:p>
+      <w:pPr>
+        <w:pStyle w:val="Heading1"/>
+      </w:pPr>
+      <w:r>
         <w:t>Build in Release mode</w:t>
       </w:r>
     </w:p>
@@ -49,6 +372,7 @@
         <w:pStyle w:val="Heading1"/>
       </w:pPr>
       <w:r>
+        <w:lastRenderedPageBreak/>
         <w:t>BIOS update</w:t>
       </w:r>
       <w:r>
@@ -440,116 +764,116 @@
         <w:pStyle w:val="Heading1"/>
       </w:pPr>
       <w:r>
+        <w:t>Application priority tuning</w:t>
+      </w:r>
+    </w:p>
+    <w:p>
+      <w:r>
+        <w:t>To ensure smooth operation with the Varjo, the Render Module must be run with high priority. This can be done from the Windows command line using the following:</w:t>
+      </w:r>
+    </w:p>
+    <w:p>
+      <w:pPr>
+        <w:rPr>
+          <w:i/>
+          <w:iCs/>
+        </w:rPr>
+      </w:pPr>
+      <w:r>
+        <w:rPr>
+          <w:i/>
+          <w:iCs/>
+        </w:rPr>
+        <w:t>start "" /high "C:\Program Files (x86)\ASDP_Render_Module\bin\ASDP_Render_Module.exe" [command line arguments]</w:t>
+      </w:r>
+    </w:p>
+    <w:p>
+      <w:pPr>
+        <w:pStyle w:val="Heading1"/>
+      </w:pPr>
+      <w:r>
+        <w:t>Display tuning</w:t>
+      </w:r>
+    </w:p>
+    <w:p>
+      <w:r>
+        <w:t xml:space="preserve">When driving the Samsung 8K display, both Windows 11 and Linux can drive at </w:t>
+      </w:r>
+      <w:r>
+        <w:rPr>
+          <w:b/>
+          <w:bCs/>
+        </w:rPr>
+        <w:t>7680x4320 at 59.94 Hz</w:t>
+      </w:r>
+      <w:r>
+        <w:t>. Windows 11 can also drive the display at that resolution at 60Hz.</w:t>
+      </w:r>
+    </w:p>
+    <w:p>
+      <w:r>
+        <w:t xml:space="preserve">When driving one particular HD display, Linux </w:t>
+      </w:r>
+      <w:r>
+        <w:t xml:space="preserve">can </w:t>
+      </w:r>
+      <w:r>
+        <w:t>drive 1920x1080 (which we’ll only display 1280x1024 of the pixels on) at both 60 and 59.94 Hz. Windows 11 is also able to display at both 60 and 59.94 on this monitor.</w:t>
+      </w:r>
+    </w:p>
+    <w:p>
+      <w:r>
+        <w:t xml:space="preserve">To make the IR camera inputs synchronized to the displays, minimizing latency over all frames, we’ll plan to </w:t>
+      </w:r>
+      <w:r>
+        <w:rPr>
+          <w:b/>
+          <w:bCs/>
+        </w:rPr>
+        <w:t xml:space="preserve">drive </w:t>
+      </w:r>
+      <w:r>
+        <w:rPr>
+          <w:b/>
+          <w:bCs/>
+        </w:rPr>
+        <w:t xml:space="preserve">both </w:t>
+      </w:r>
+      <w:r>
+        <w:rPr>
+          <w:b/>
+          <w:bCs/>
+        </w:rPr>
+        <w:t xml:space="preserve">displays </w:t>
+      </w:r>
+      <w:r>
+        <w:rPr>
+          <w:b/>
+          <w:bCs/>
+        </w:rPr>
+        <w:t xml:space="preserve">in both operating systems </w:t>
+      </w:r>
+      <w:r>
+        <w:rPr>
+          <w:b/>
+          <w:bCs/>
+        </w:rPr>
+        <w:t>at 59.94H</w:t>
+      </w:r>
+      <w:r>
+        <w:rPr>
+          <w:b/>
+          <w:bCs/>
+        </w:rPr>
+        <w:t>z and sync the cameras at that rate when possible</w:t>
+      </w:r>
+      <w:r>
+        <w:t>.</w:t>
+      </w:r>
+    </w:p>
+    <w:p>
+      <w:r>
         <w:lastRenderedPageBreak/>
-        <w:t>Application priority tuning</w:t>
-      </w:r>
-    </w:p>
-    <w:p>
-      <w:r>
-        <w:t>To ensure smooth operation with the Varjo, the Render Module must be run with high priority. This can be done from the Windows command line using the following:</w:t>
-      </w:r>
-    </w:p>
-    <w:p>
-      <w:pPr>
-        <w:rPr>
-          <w:i/>
-          <w:iCs/>
-        </w:rPr>
-      </w:pPr>
-      <w:r>
-        <w:rPr>
-          <w:i/>
-          <w:iCs/>
-        </w:rPr>
-        <w:t>start "" /high "C:\Program Files (x86)\ASDP_Render_Module\bin\ASDP_Render_Module.exe" [command line arguments]</w:t>
-      </w:r>
-    </w:p>
-    <w:p>
-      <w:pPr>
-        <w:pStyle w:val="Heading1"/>
-      </w:pPr>
-      <w:r>
-        <w:t>Display tuning</w:t>
-      </w:r>
-    </w:p>
-    <w:p>
-      <w:r>
-        <w:t xml:space="preserve">When driving the Samsung 8K display, both Windows 11 and Linux can drive at </w:t>
-      </w:r>
-      <w:r>
-        <w:rPr>
-          <w:b/>
-          <w:bCs/>
-        </w:rPr>
-        <w:t>7680x4320 at 59.94 Hz</w:t>
-      </w:r>
-      <w:r>
-        <w:t>. Windows 11 can also drive the display at that resolution at 60Hz.</w:t>
-      </w:r>
-    </w:p>
-    <w:p>
-      <w:r>
-        <w:t xml:space="preserve">When driving one particular HD display, Linux </w:t>
-      </w:r>
-      <w:r>
-        <w:t xml:space="preserve">can </w:t>
-      </w:r>
-      <w:r>
-        <w:t>drive 1920x1080 (which we’ll only display 1280x1024 of the pixels on) at both 60 and 59.94 Hz. Windows 11 is also able to display at both 60 and 59.94 on this monitor.</w:t>
-      </w:r>
-    </w:p>
-    <w:p>
-      <w:r>
-        <w:t xml:space="preserve">To make the IR camera inputs synchronized to the displays, minimizing latency over all frames, we’ll plan to </w:t>
-      </w:r>
-      <w:r>
-        <w:rPr>
-          <w:b/>
-          <w:bCs/>
-        </w:rPr>
-        <w:t xml:space="preserve">drive </w:t>
-      </w:r>
-      <w:r>
-        <w:rPr>
-          <w:b/>
-          <w:bCs/>
-        </w:rPr>
-        <w:t xml:space="preserve">both </w:t>
-      </w:r>
-      <w:r>
-        <w:rPr>
-          <w:b/>
-          <w:bCs/>
-        </w:rPr>
-        <w:t xml:space="preserve">displays </w:t>
-      </w:r>
-      <w:r>
-        <w:rPr>
-          <w:b/>
-          <w:bCs/>
-        </w:rPr>
-        <w:t xml:space="preserve">in both operating systems </w:t>
-      </w:r>
-      <w:r>
-        <w:rPr>
-          <w:b/>
-          <w:bCs/>
-        </w:rPr>
-        <w:t>at 59.94H</w:t>
-      </w:r>
-      <w:r>
-        <w:rPr>
-          <w:b/>
-          <w:bCs/>
-        </w:rPr>
-        <w:t>z and sync the cameras at that rate when possible</w:t>
-      </w:r>
-      <w:r>
-        <w:t>.</w:t>
-      </w:r>
-    </w:p>
-    <w:p>
-      <w:r>
         <w:t xml:space="preserve">When using the </w:t>
       </w:r>
       <w:r>
@@ -985,129 +1309,132 @@
         <w:pStyle w:val="Heading1"/>
       </w:pPr>
       <w:r>
+        <w:t>Disk tuning</w:t>
+      </w:r>
+    </w:p>
+    <w:p>
+      <w:r>
+        <w:rPr>
+          <w:b/>
+          <w:bCs/>
+        </w:rPr>
+        <w:t>Direct writes:</w:t>
+      </w:r>
+      <w:r>
+        <w:t xml:space="preserve"> When writing sequentially to LLVM drives in hardware RAID configuration, the internal operating system buffers slow down the system. On Linux, it is possible to specify that file data be directly read from the client buffers by passing the </w:t>
+      </w:r>
+      <w:r>
+        <w:rPr>
+          <w:i/>
+          <w:iCs/>
+        </w:rPr>
+        <w:t>O_DIRECT</w:t>
+      </w:r>
+      <w:r>
+        <w:t xml:space="preserve"> flag to the open() system call when opening the file.</w:t>
+      </w:r>
+      <w:r>
+        <w:t xml:space="preserve"> </w:t>
+      </w:r>
+      <w:r>
+        <w:rPr>
+          <w:b/>
+          <w:bCs/>
+        </w:rPr>
+        <w:t>Note:</w:t>
+      </w:r>
+      <w:r>
+        <w:t xml:space="preserve"> When using direct write, the number of bytes written in any write must be a multiple of</w:t>
+      </w:r>
+      <w:r>
+        <w:t xml:space="preserve"> the block size (</w:t>
+      </w:r>
+      <w:r>
+        <w:t>512</w:t>
+      </w:r>
+      <w:r>
+        <w:t xml:space="preserve"> for our disks)</w:t>
+      </w:r>
+      <w:r>
+        <w:t>. This makes its use problematic because the last block in a file must include zero padding, which will cause our reading code to assume additional messages are present.</w:t>
+      </w:r>
+      <w:r>
+        <w:t xml:space="preserve"> </w:t>
+      </w:r>
+      <w:r>
+        <w:rPr>
+          <w:b/>
+          <w:bCs/>
+        </w:rPr>
+        <w:t>Note:</w:t>
+      </w:r>
+      <w:r>
+        <w:t xml:space="preserve"> This restriction also holds for using writev, in which case each of the individual blocks must also be a multiple of 512 in size. </w:t>
+      </w:r>
+      <w:r>
+        <w:rPr>
+          <w:b/>
+          <w:bCs/>
+        </w:rPr>
+        <w:t>Note:</w:t>
+      </w:r>
+      <w:r>
+        <w:t xml:space="preserve"> The work of aggregating smaller blocks into a single in-memory block prior to writing slows us down as much as not using O_DIRECT mode.</w:t>
+      </w:r>
+      <w:r>
+        <w:t xml:space="preserve"> </w:t>
+      </w:r>
+      <w:r>
+        <w:rPr>
+          <w:b/>
+          <w:bCs/>
+        </w:rPr>
+        <w:t>Note:</w:t>
+      </w:r>
+      <w:r>
+        <w:t xml:space="preserve"> This was handled in the API by enabling StreamPackets to be written sequentially into the same large buffer; the plan is to write that buffer when it becomes full and copy the remaining unwritten bytes into a new buffer ready to be filled, then flush the (zero-padded) empty buffer at the end of writing.</w:t>
+      </w:r>
+    </w:p>
+    <w:p>
+      <w:r>
+        <w:rPr>
+          <w:b/>
+          <w:bCs/>
+        </w:rPr>
+        <w:t>TRIM:</w:t>
+      </w:r>
+      <w:r>
+        <w:t xml:space="preserve"> SSD drives must explicitly erase old blocks before re-use, which sometimes requires consolidation of information from partial blocks. If this is not done before the buffers are needed for new writes, writing performance can slow down. On Linux, the </w:t>
+      </w:r>
+      <w:r>
+        <w:rPr>
+          <w:i/>
+          <w:iCs/>
+        </w:rPr>
+        <w:t>fstrim</w:t>
+      </w:r>
+      <w:r>
+        <w:t xml:space="preserve"> command can be used to manually clear out old buffers. Also, the </w:t>
+      </w:r>
+      <w:r>
+        <w:rPr>
+          <w:i/>
+          <w:iCs/>
+        </w:rPr>
+        <w:t>discard</w:t>
+      </w:r>
+      <w:r>
+        <w:t xml:space="preserve"> option </w:t>
+      </w:r>
+      <w:r>
+        <w:t>should not</w:t>
+      </w:r>
+      <w:r>
+        <w:t xml:space="preserve"> be </w:t>
+      </w:r>
+      <w:r>
         <w:lastRenderedPageBreak/>
-        <w:t>Disk tuning</w:t>
-      </w:r>
-    </w:p>
-    <w:p>
-      <w:r>
-        <w:rPr>
-          <w:b/>
-          <w:bCs/>
-        </w:rPr>
-        <w:t>Direct writes:</w:t>
-      </w:r>
-      <w:r>
-        <w:t xml:space="preserve"> When writing sequentially to LLVM drives in hardware RAID configuration, the internal operating system buffers slow down the system. On Linux, it is possible to specify that file data be directly read from the client buffers by passing the </w:t>
-      </w:r>
-      <w:r>
-        <w:rPr>
-          <w:i/>
-          <w:iCs/>
-        </w:rPr>
-        <w:t>O_DIRECT</w:t>
-      </w:r>
-      <w:r>
-        <w:t xml:space="preserve"> flag to the open() system call when opening the file.</w:t>
-      </w:r>
-      <w:r>
-        <w:t xml:space="preserve"> </w:t>
-      </w:r>
-      <w:r>
-        <w:rPr>
-          <w:b/>
-          <w:bCs/>
-        </w:rPr>
-        <w:t>Note:</w:t>
-      </w:r>
-      <w:r>
-        <w:t xml:space="preserve"> When using direct write, the number of bytes written in any write must be a multiple of</w:t>
-      </w:r>
-      <w:r>
-        <w:t xml:space="preserve"> the block size (</w:t>
-      </w:r>
-      <w:r>
-        <w:t>512</w:t>
-      </w:r>
-      <w:r>
-        <w:t xml:space="preserve"> for our disks)</w:t>
-      </w:r>
-      <w:r>
-        <w:t>. This makes its use problematic because the last block in a file must include zero padding, which will cause our reading code to assume additional messages are present.</w:t>
-      </w:r>
-      <w:r>
-        <w:t xml:space="preserve"> </w:t>
-      </w:r>
-      <w:r>
-        <w:rPr>
-          <w:b/>
-          <w:bCs/>
-        </w:rPr>
-        <w:t>Note:</w:t>
-      </w:r>
-      <w:r>
-        <w:t xml:space="preserve"> This restriction also holds for using writev, in which case each of the individual blocks must also be a multiple of 512 in size. </w:t>
-      </w:r>
-      <w:r>
-        <w:rPr>
-          <w:b/>
-          <w:bCs/>
-        </w:rPr>
-        <w:t>Note:</w:t>
-      </w:r>
-      <w:r>
-        <w:t xml:space="preserve"> The work of aggregating smaller blocks into a single in-memory block prior to writing slows us down as much as not using O_DIRECT mode.</w:t>
-      </w:r>
-      <w:r>
-        <w:t xml:space="preserve"> </w:t>
-      </w:r>
-      <w:r>
-        <w:rPr>
-          <w:b/>
-          <w:bCs/>
-        </w:rPr>
-        <w:t>Note:</w:t>
-      </w:r>
-      <w:r>
-        <w:t xml:space="preserve"> This was handled in the API by enabling StreamPackets to be written sequentially into the same large buffer; the plan is to write that buffer when it becomes full and copy the remaining unwritten bytes into a new buffer ready to be filled, then flush the (zero-padded) empty buffer at the end of writing.</w:t>
-      </w:r>
-    </w:p>
-    <w:p>
-      <w:r>
-        <w:rPr>
-          <w:b/>
-          <w:bCs/>
-        </w:rPr>
-        <w:t>TRIM:</w:t>
-      </w:r>
-      <w:r>
-        <w:t xml:space="preserve"> SSD drives must explicitly erase old blocks before re-use, which sometimes requires consolidation of information from partial blocks. If this is not done before the buffers are needed for new writes, writing performance can slow down. On Linux, the </w:t>
-      </w:r>
-      <w:r>
-        <w:rPr>
-          <w:i/>
-          <w:iCs/>
-        </w:rPr>
-        <w:t>fstrim</w:t>
-      </w:r>
-      <w:r>
-        <w:t xml:space="preserve"> command can be used to manually clear out old buffers. Also, the </w:t>
-      </w:r>
-      <w:r>
-        <w:rPr>
-          <w:i/>
-          <w:iCs/>
-        </w:rPr>
-        <w:t>discard</w:t>
-      </w:r>
-      <w:r>
-        <w:t xml:space="preserve"> option </w:t>
-      </w:r>
-      <w:r>
-        <w:t>should not</w:t>
-      </w:r>
-      <w:r>
-        <w:t xml:space="preserve"> be added to the </w:t>
+        <w:t xml:space="preserve">added to the </w:t>
       </w:r>
       <w:r>
         <w:rPr>
@@ -1327,7 +1654,6 @@
         </w:numPr>
       </w:pPr>
       <w:r>
-        <w:lastRenderedPageBreak/>
         <w:t>(</w:t>
       </w:r>
       <w:r>
@@ -1584,6 +1910,7 @@
         </w:numPr>
       </w:pPr>
       <w:r>
+        <w:lastRenderedPageBreak/>
         <w:t xml:space="preserve">(Fixed in the more recent adapter driver available in April 2025.) </w:t>
       </w:r>
       <w:r>
@@ -1907,7 +2234,6 @@
         </w:numPr>
       </w:pPr>
       <w:r>
-        <w:lastRenderedPageBreak/>
         <w:t>R</w:t>
       </w:r>
       <w:r>
@@ -2134,7 +2460,11 @@
         <w:t xml:space="preserve"> this command to configure HIGH_THROUGHPUT </w:t>
       </w:r>
       <w:r>
-        <w:t xml:space="preserve">on all systems where we were able </w:t>
+        <w:t xml:space="preserve">on all systems </w:t>
+      </w:r>
+      <w:r>
+        <w:lastRenderedPageBreak/>
+        <w:t xml:space="preserve">where we were able </w:t>
       </w:r>
       <w:r>
         <w:t xml:space="preserve">to get full-rate </w:t>
@@ -2473,214 +2803,214 @@
           <w:b/>
           <w:bCs/>
         </w:rPr>
+        <w:t>Open Fabric:</w:t>
+      </w:r>
+      <w:r>
+        <w:t xml:space="preserve"> NVidia has a set of “open fabric” drivers that can provide a unified address space among 100GigE-connected hosts and their GPUs that handles virtual memory among all devices. If needed, this could be used for transferring data from the Storage Server to the Render Server.</w:t>
+      </w:r>
+      <w:r>
+        <w:rPr>
+          <w:rStyle w:val="FootnoteReference"/>
+        </w:rPr>
+        <w:footnoteReference w:id="9"/>
+      </w:r>
+    </w:p>
+    <w:p>
+      <w:r>
+        <w:rPr>
+          <w:b/>
+          <w:bCs/>
+        </w:rPr>
+        <w:t>network_tuning.sh:</w:t>
+      </w:r>
+      <w:r>
+        <w:t xml:space="preserve"> This script lives in the ASDP_Core_API directory. It can be copied into /usr/local/bin and made executable and then add the following to the file /etc/system/system/network_tuning.service</w:t>
+      </w:r>
+      <w:r>
+        <w:t xml:space="preserve"> and then run </w:t>
+      </w:r>
+      <w:r>
+        <w:rPr>
+          <w:b/>
+          <w:bCs/>
+          <w:i/>
+          <w:iCs/>
+        </w:rPr>
+        <w:t>sudo systemctl daemon-reload</w:t>
+      </w:r>
+      <w:r>
+        <w:t xml:space="preserve"> and</w:t>
+      </w:r>
+      <w:r>
+        <w:rPr>
+          <w:b/>
+          <w:bCs/>
+          <w:i/>
+          <w:iCs/>
+        </w:rPr>
+        <w:t xml:space="preserve"> sudo systemctl enable my-startup.service</w:t>
+      </w:r>
+      <w:r>
+        <w:t xml:space="preserve"> </w:t>
+      </w:r>
+      <w:r>
+        <w:t>:</w:t>
+      </w:r>
+    </w:p>
+    <w:p>
+      <w:pPr>
+        <w:spacing w:after="0" w:line="240" w:lineRule="auto"/>
+        <w:rPr>
+          <w:rFonts w:ascii="Courier New" w:hAnsi="Courier New" w:cs="Courier New"/>
+        </w:rPr>
+      </w:pPr>
+      <w:r>
+        <w:rPr>
+          <w:rFonts w:ascii="Courier New" w:hAnsi="Courier New" w:cs="Courier New"/>
+        </w:rPr>
+        <w:t>[Unit]</w:t>
+      </w:r>
+    </w:p>
+    <w:p>
+      <w:pPr>
+        <w:spacing w:after="0" w:line="240" w:lineRule="auto"/>
+        <w:rPr>
+          <w:rFonts w:ascii="Courier New" w:hAnsi="Courier New" w:cs="Courier New"/>
+        </w:rPr>
+      </w:pPr>
+      <w:r>
+        <w:rPr>
+          <w:rFonts w:ascii="Courier New" w:hAnsi="Courier New" w:cs="Courier New"/>
+        </w:rPr>
+        <w:t>Description=ASDP Network Tuning</w:t>
+      </w:r>
+    </w:p>
+    <w:p>
+      <w:pPr>
+        <w:spacing w:after="0" w:line="240" w:lineRule="auto"/>
+        <w:rPr>
+          <w:rFonts w:ascii="Courier New" w:hAnsi="Courier New" w:cs="Courier New"/>
+        </w:rPr>
+      </w:pPr>
+      <w:r>
+        <w:rPr>
+          <w:rFonts w:ascii="Courier New" w:hAnsi="Courier New" w:cs="Courier New"/>
+        </w:rPr>
+        <w:t>Wants=network.target</w:t>
+      </w:r>
+    </w:p>
+    <w:p>
+      <w:pPr>
+        <w:spacing w:after="0" w:line="240" w:lineRule="auto"/>
+        <w:rPr>
+          <w:rFonts w:ascii="Courier New" w:hAnsi="Courier New" w:cs="Courier New"/>
+        </w:rPr>
+      </w:pPr>
+      <w:r>
+        <w:rPr>
+          <w:rFonts w:ascii="Courier New" w:hAnsi="Courier New" w:cs="Courier New"/>
+        </w:rPr>
+        <w:t>After=network.target</w:t>
+      </w:r>
+    </w:p>
+    <w:p>
+      <w:pPr>
+        <w:spacing w:after="0" w:line="240" w:lineRule="auto"/>
+        <w:rPr>
+          <w:rFonts w:ascii="Courier New" w:hAnsi="Courier New" w:cs="Courier New"/>
+        </w:rPr>
+      </w:pPr>
+    </w:p>
+    <w:p>
+      <w:pPr>
+        <w:spacing w:after="0" w:line="240" w:lineRule="auto"/>
+        <w:rPr>
+          <w:rFonts w:ascii="Courier New" w:hAnsi="Courier New" w:cs="Courier New"/>
+        </w:rPr>
+      </w:pPr>
+      <w:r>
+        <w:rPr>
+          <w:rFonts w:ascii="Courier New" w:hAnsi="Courier New" w:cs="Courier New"/>
+        </w:rPr>
+        <w:t>[Service]</w:t>
+      </w:r>
+    </w:p>
+    <w:p>
+      <w:pPr>
+        <w:spacing w:after="0" w:line="240" w:lineRule="auto"/>
+        <w:rPr>
+          <w:rFonts w:ascii="Courier New" w:hAnsi="Courier New" w:cs="Courier New"/>
+        </w:rPr>
+      </w:pPr>
+      <w:r>
+        <w:rPr>
+          <w:rFonts w:ascii="Courier New" w:hAnsi="Courier New" w:cs="Courier New"/>
+        </w:rPr>
+        <w:t>ExecStart=/usr/local/bin/network_tuning.sh</w:t>
+      </w:r>
+    </w:p>
+    <w:p>
+      <w:pPr>
+        <w:spacing w:after="0" w:line="240" w:lineRule="auto"/>
+        <w:rPr>
+          <w:rFonts w:ascii="Courier New" w:hAnsi="Courier New" w:cs="Courier New"/>
+        </w:rPr>
+      </w:pPr>
+      <w:r>
+        <w:rPr>
+          <w:rFonts w:ascii="Courier New" w:hAnsi="Courier New" w:cs="Courier New"/>
+        </w:rPr>
+        <w:t>Type=oneshot</w:t>
+      </w:r>
+    </w:p>
+    <w:p>
+      <w:pPr>
+        <w:spacing w:after="0" w:line="240" w:lineRule="auto"/>
+        <w:rPr>
+          <w:rFonts w:ascii="Courier New" w:hAnsi="Courier New" w:cs="Courier New"/>
+        </w:rPr>
+      </w:pPr>
+      <w:r>
+        <w:rPr>
+          <w:rFonts w:ascii="Courier New" w:hAnsi="Courier New" w:cs="Courier New"/>
+        </w:rPr>
+        <w:t>RemainAfterExit=yes</w:t>
+      </w:r>
+    </w:p>
+    <w:p>
+      <w:pPr>
+        <w:spacing w:after="0" w:line="240" w:lineRule="auto"/>
+        <w:rPr>
+          <w:rFonts w:ascii="Courier New" w:hAnsi="Courier New" w:cs="Courier New"/>
+        </w:rPr>
+      </w:pPr>
+    </w:p>
+    <w:p>
+      <w:pPr>
+        <w:spacing w:after="0" w:line="240" w:lineRule="auto"/>
+        <w:rPr>
+          <w:rFonts w:ascii="Courier New" w:hAnsi="Courier New" w:cs="Courier New"/>
+        </w:rPr>
+      </w:pPr>
+      <w:r>
+        <w:rPr>
+          <w:rFonts w:ascii="Courier New" w:hAnsi="Courier New" w:cs="Courier New"/>
+        </w:rPr>
+        <w:t>[Install]</w:t>
+      </w:r>
+    </w:p>
+    <w:p>
+      <w:pPr>
+        <w:spacing w:after="0" w:line="240" w:lineRule="auto"/>
+        <w:rPr>
+          <w:rFonts w:ascii="Courier New" w:hAnsi="Courier New" w:cs="Courier New"/>
+        </w:rPr>
+      </w:pPr>
+      <w:r>
+        <w:rPr>
+          <w:rFonts w:ascii="Courier New" w:hAnsi="Courier New" w:cs="Courier New"/>
+        </w:rPr>
         <w:lastRenderedPageBreak/>
-        <w:t>Open Fabric:</w:t>
-      </w:r>
-      <w:r>
-        <w:t xml:space="preserve"> NVidia has a set of “open fabric” drivers that can provide a unified address space among 100GigE-connected hosts and their GPUs that handles virtual memory among all devices. If needed, this could be used for transferring data from the Storage Server to the Render Server.</w:t>
-      </w:r>
-      <w:r>
-        <w:rPr>
-          <w:rStyle w:val="FootnoteReference"/>
-        </w:rPr>
-        <w:footnoteReference w:id="9"/>
-      </w:r>
-    </w:p>
-    <w:p>
-      <w:r>
-        <w:rPr>
-          <w:b/>
-          <w:bCs/>
-        </w:rPr>
-        <w:t>network_tuning.sh:</w:t>
-      </w:r>
-      <w:r>
-        <w:t xml:space="preserve"> This script lives in the ASDP_Core_API directory. It can be copied into /usr/local/bin and made executable and then add the following to the file /etc/system/system/network_tuning.service</w:t>
-      </w:r>
-      <w:r>
-        <w:t xml:space="preserve"> and then run </w:t>
-      </w:r>
-      <w:r>
-        <w:rPr>
-          <w:b/>
-          <w:bCs/>
-          <w:i/>
-          <w:iCs/>
-        </w:rPr>
-        <w:t>sudo systemctl daemon-reload</w:t>
-      </w:r>
-      <w:r>
-        <w:t xml:space="preserve"> and</w:t>
-      </w:r>
-      <w:r>
-        <w:rPr>
-          <w:b/>
-          <w:bCs/>
-          <w:i/>
-          <w:iCs/>
-        </w:rPr>
-        <w:t xml:space="preserve"> sudo systemctl enable my-startup.service</w:t>
-      </w:r>
-      <w:r>
-        <w:t xml:space="preserve"> </w:t>
-      </w:r>
-      <w:r>
-        <w:t>:</w:t>
-      </w:r>
-    </w:p>
-    <w:p>
-      <w:pPr>
-        <w:spacing w:after="0" w:line="240" w:lineRule="auto"/>
-        <w:rPr>
-          <w:rFonts w:ascii="Courier New" w:hAnsi="Courier New" w:cs="Courier New"/>
-        </w:rPr>
-      </w:pPr>
-      <w:r>
-        <w:rPr>
-          <w:rFonts w:ascii="Courier New" w:hAnsi="Courier New" w:cs="Courier New"/>
-        </w:rPr>
-        <w:t>[Unit]</w:t>
-      </w:r>
-    </w:p>
-    <w:p>
-      <w:pPr>
-        <w:spacing w:after="0" w:line="240" w:lineRule="auto"/>
-        <w:rPr>
-          <w:rFonts w:ascii="Courier New" w:hAnsi="Courier New" w:cs="Courier New"/>
-        </w:rPr>
-      </w:pPr>
-      <w:r>
-        <w:rPr>
-          <w:rFonts w:ascii="Courier New" w:hAnsi="Courier New" w:cs="Courier New"/>
-        </w:rPr>
-        <w:t>Description=ASDP Network Tuning</w:t>
-      </w:r>
-    </w:p>
-    <w:p>
-      <w:pPr>
-        <w:spacing w:after="0" w:line="240" w:lineRule="auto"/>
-        <w:rPr>
-          <w:rFonts w:ascii="Courier New" w:hAnsi="Courier New" w:cs="Courier New"/>
-        </w:rPr>
-      </w:pPr>
-      <w:r>
-        <w:rPr>
-          <w:rFonts w:ascii="Courier New" w:hAnsi="Courier New" w:cs="Courier New"/>
-        </w:rPr>
-        <w:t>Wants=network.target</w:t>
-      </w:r>
-    </w:p>
-    <w:p>
-      <w:pPr>
-        <w:spacing w:after="0" w:line="240" w:lineRule="auto"/>
-        <w:rPr>
-          <w:rFonts w:ascii="Courier New" w:hAnsi="Courier New" w:cs="Courier New"/>
-        </w:rPr>
-      </w:pPr>
-      <w:r>
-        <w:rPr>
-          <w:rFonts w:ascii="Courier New" w:hAnsi="Courier New" w:cs="Courier New"/>
-        </w:rPr>
-        <w:t>After=network.target</w:t>
-      </w:r>
-    </w:p>
-    <w:p>
-      <w:pPr>
-        <w:spacing w:after="0" w:line="240" w:lineRule="auto"/>
-        <w:rPr>
-          <w:rFonts w:ascii="Courier New" w:hAnsi="Courier New" w:cs="Courier New"/>
-        </w:rPr>
-      </w:pPr>
-    </w:p>
-    <w:p>
-      <w:pPr>
-        <w:spacing w:after="0" w:line="240" w:lineRule="auto"/>
-        <w:rPr>
-          <w:rFonts w:ascii="Courier New" w:hAnsi="Courier New" w:cs="Courier New"/>
-        </w:rPr>
-      </w:pPr>
-      <w:r>
-        <w:rPr>
-          <w:rFonts w:ascii="Courier New" w:hAnsi="Courier New" w:cs="Courier New"/>
-        </w:rPr>
-        <w:t>[Service]</w:t>
-      </w:r>
-    </w:p>
-    <w:p>
-      <w:pPr>
-        <w:spacing w:after="0" w:line="240" w:lineRule="auto"/>
-        <w:rPr>
-          <w:rFonts w:ascii="Courier New" w:hAnsi="Courier New" w:cs="Courier New"/>
-        </w:rPr>
-      </w:pPr>
-      <w:r>
-        <w:rPr>
-          <w:rFonts w:ascii="Courier New" w:hAnsi="Courier New" w:cs="Courier New"/>
-        </w:rPr>
-        <w:t>ExecStart=/usr/local/bin/network_tuning.sh</w:t>
-      </w:r>
-    </w:p>
-    <w:p>
-      <w:pPr>
-        <w:spacing w:after="0" w:line="240" w:lineRule="auto"/>
-        <w:rPr>
-          <w:rFonts w:ascii="Courier New" w:hAnsi="Courier New" w:cs="Courier New"/>
-        </w:rPr>
-      </w:pPr>
-      <w:r>
-        <w:rPr>
-          <w:rFonts w:ascii="Courier New" w:hAnsi="Courier New" w:cs="Courier New"/>
-        </w:rPr>
-        <w:t>Type=oneshot</w:t>
-      </w:r>
-    </w:p>
-    <w:p>
-      <w:pPr>
-        <w:spacing w:after="0" w:line="240" w:lineRule="auto"/>
-        <w:rPr>
-          <w:rFonts w:ascii="Courier New" w:hAnsi="Courier New" w:cs="Courier New"/>
-        </w:rPr>
-      </w:pPr>
-      <w:r>
-        <w:rPr>
-          <w:rFonts w:ascii="Courier New" w:hAnsi="Courier New" w:cs="Courier New"/>
-        </w:rPr>
-        <w:t>RemainAfterExit=yes</w:t>
-      </w:r>
-    </w:p>
-    <w:p>
-      <w:pPr>
-        <w:spacing w:after="0" w:line="240" w:lineRule="auto"/>
-        <w:rPr>
-          <w:rFonts w:ascii="Courier New" w:hAnsi="Courier New" w:cs="Courier New"/>
-        </w:rPr>
-      </w:pPr>
-    </w:p>
-    <w:p>
-      <w:pPr>
-        <w:spacing w:after="0" w:line="240" w:lineRule="auto"/>
-        <w:rPr>
-          <w:rFonts w:ascii="Courier New" w:hAnsi="Courier New" w:cs="Courier New"/>
-        </w:rPr>
-      </w:pPr>
-      <w:r>
-        <w:rPr>
-          <w:rFonts w:ascii="Courier New" w:hAnsi="Courier New" w:cs="Courier New"/>
-        </w:rPr>
-        <w:t>[Install]</w:t>
-      </w:r>
-    </w:p>
-    <w:p>
-      <w:pPr>
-        <w:spacing w:after="0" w:line="240" w:lineRule="auto"/>
-        <w:rPr>
-          <w:rFonts w:ascii="Courier New" w:hAnsi="Courier New" w:cs="Courier New"/>
-        </w:rPr>
-      </w:pPr>
-      <w:r>
-        <w:rPr>
-          <w:rFonts w:ascii="Courier New" w:hAnsi="Courier New" w:cs="Courier New"/>
-        </w:rPr>
         <w:t>WantedBy=multi-user.target</w:t>
       </w:r>
     </w:p>
@@ -3203,7 +3533,7 @@
 </file>
 
 <file path=word/endnotes.xml><?xml version="1.0" encoding="utf-8"?>
-<w:endnotes xmlns:wpc="http://schemas.microsoft.com/office/word/2010/wordprocessingCanvas" xmlns:cx="http://schemas.microsoft.com/office/drawing/2014/chartex" xmlns:cx1="http://schemas.microsoft.com/office/drawing/2015/9/8/chartex" xmlns:cx2="http://schemas.microsoft.com/office/drawing/2015/10/21/chartex" xmlns:cx3="http://schemas.microsoft.com/office/drawing/2016/5/9/chartex" xmlns:cx4="http://schemas.microsoft.com/office/drawing/2016/5/10/chartex" xmlns:cx5="http://schemas.microsoft.com/office/drawing/2016/5/11/chartex" xmlns:cx6="http://schemas.microsoft.com/office/drawing/2016/5/12/chartex" xmlns:cx7="http://schemas.microsoft.com/office/drawing/2016/5/13/chartex" xmlns:cx8="http://schemas.microsoft.com/office/drawing/2016/5/14/chartex" xmlns:mc="http://schemas.openxmlformats.org/markup-compatibility/2006" xmlns:aink="http://schemas.microsoft.com/office/drawing/2016/ink" xmlns:am3d="http://schemas.microsoft.com/office/drawing/2017/model3d" xmlns:o="urn:schemas-microsoft-com:office:office" xmlns:oel="http://schemas.microsoft.com/office/2019/extlst" xmlns:r="http://schemas.openxmlformats.org/officeDocument/2006/relationships" xmlns:m="http://schemas.openxmlformats.org/officeDocument/2006/math" xmlns:v="urn:schemas-microsoft-com:vml" xmlns:wp14="http://schemas.microsoft.com/office/word/2010/wordprocessingDrawing" xmlns:wp="http://schemas.openxmlformats.org/drawingml/2006/wordprocessingDrawing" xmlns:w10="urn:schemas-microsoft-com:office:word" xmlns:w="http://schemas.openxmlformats.org/wordprocessingml/2006/main" xmlns:w14="http://schemas.microsoft.com/office/word/2010/wordml" xmlns:w15="http://schemas.microsoft.com/office/word/2012/wordml" xmlns:w16cex="http://schemas.microsoft.com/office/word/2018/wordml/cex" xmlns:w16cid="http://schemas.microsoft.com/office/word/2016/wordml/cid" xmlns:w16="http://schemas.microsoft.com/office/word/2018/wordml" xmlns:w16du="http://schemas.microsoft.com/office/word/2023/wordml/word16du" xmlns:w16sdtdh="http://schemas.microsoft.com/office/word/2020/wordml/sdtdatahash" xmlns:w16sdtfl="http://schemas.microsoft.com/office/word/2024/wordml/sdtformatlock" xmlns:w16se="http://schemas.microsoft.com/office/word/2015/wordml/symex" xmlns:wpg="http://schemas.microsoft.com/office/word/2010/wordprocessingGroup" xmlns:wpi="http://schemas.microsoft.com/office/word/2010/wordprocessingInk" xmlns:wne="http://schemas.microsoft.com/office/word/2006/wordml" xmlns:wps="http://schemas.microsoft.com/office/word/2010/wordprocessingShape" mc:Ignorable="w14 w15 w16se w16cid w16 w16cex w16sdtdh w16sdtfl w16du wp14">
+<w:endnotes xmlns:wpc="http://schemas.microsoft.com/office/word/2010/wordprocessingCanvas" xmlns:cx="http://schemas.microsoft.com/office/drawing/2014/chartex" xmlns:cx1="http://schemas.microsoft.com/office/drawing/2015/9/8/chartex" xmlns:cx2="http://schemas.microsoft.com/office/drawing/2015/10/21/chartex" xmlns:cx3="http://schemas.microsoft.com/office/drawing/2016/5/9/chartex" xmlns:cx4="http://schemas.microsoft.com/office/drawing/2016/5/10/chartex" xmlns:cx5="http://schemas.microsoft.com/office/drawing/2016/5/11/chartex" xmlns:cx6="http://schemas.microsoft.com/office/drawing/2016/5/12/chartex" xmlns:cx7="http://schemas.microsoft.com/office/drawing/2016/5/13/chartex" xmlns:cx8="http://schemas.microsoft.com/office/drawing/2016/5/14/chartex" xmlns:mc="http://schemas.openxmlformats.org/markup-compatibility/2006" xmlns:aink="http://schemas.microsoft.com/office/drawing/2016/ink" xmlns:am3d="http://schemas.microsoft.com/office/drawing/2017/model3d" xmlns:o="urn:schemas-microsoft-com:office:office" xmlns:oel="http://schemas.microsoft.com/office/2019/extlst" xmlns:r="http://schemas.openxmlformats.org/officeDocument/2006/relationships" xmlns:m="http://schemas.openxmlformats.org/officeDocument/2006/math" xmlns:v="urn:schemas-microsoft-com:vml" xmlns:wp14="http://schemas.microsoft.com/office/word/2010/wordprocessingDrawing" xmlns:wp="http://schemas.openxmlformats.org/drawingml/2006/wordprocessingDrawing" xmlns:w10="urn:schemas-microsoft-com:office:word" xmlns:w="http://schemas.openxmlformats.org/wordprocessingml/2006/main" xmlns:w14="http://schemas.microsoft.com/office/word/2010/wordml" xmlns:w15="http://schemas.microsoft.com/office/word/2012/wordml" xmlns:w16cei="http://schemas.microsoft.com/office/word/2026/wordml/cei" xmlns:w16cex="http://schemas.microsoft.com/office/word/2018/wordml/cex" xmlns:w16cid="http://schemas.microsoft.com/office/word/2016/wordml/cid" xmlns:w16="http://schemas.microsoft.com/office/word/2018/wordml" xmlns:w16du="http://schemas.microsoft.com/office/word/2023/wordml/word16du" xmlns:w16sdtdh="http://schemas.microsoft.com/office/word/2020/wordml/sdtdatahash" xmlns:w16sdtfl="http://schemas.microsoft.com/office/word/2024/wordml/sdtformatlock" xmlns:w16se="http://schemas.microsoft.com/office/word/2015/wordml/symex" xmlns:wpg="http://schemas.microsoft.com/office/word/2010/wordprocessingGroup" xmlns:wpi="http://schemas.microsoft.com/office/word/2010/wordprocessingInk" xmlns:wne="http://schemas.microsoft.com/office/word/2006/wordml" xmlns:wps="http://schemas.microsoft.com/office/word/2010/wordprocessingShape" mc:Ignorable="w14 w15 w16se w16cid w16 w16cex w16sdtdh w16sdtfl w16du wp14">
   <w:endnote w:type="separator" w:id="-1">
     <w:p>
       <w:pPr>
@@ -3228,7 +3558,7 @@
 </file>
 
 <file path=word/footer1.xml><?xml version="1.0" encoding="utf-8"?>
-<w:ftr xmlns:wpc="http://schemas.microsoft.com/office/word/2010/wordprocessingCanvas" xmlns:cx="http://schemas.microsoft.com/office/drawing/2014/chartex" xmlns:cx1="http://schemas.microsoft.com/office/drawing/2015/9/8/chartex" xmlns:cx2="http://schemas.microsoft.com/office/drawing/2015/10/21/chartex" xmlns:cx3="http://schemas.microsoft.com/office/drawing/2016/5/9/chartex" xmlns:cx4="http://schemas.microsoft.com/office/drawing/2016/5/10/chartex" xmlns:cx5="http://schemas.microsoft.com/office/drawing/2016/5/11/chartex" xmlns:cx6="http://schemas.microsoft.com/office/drawing/2016/5/12/chartex" xmlns:cx7="http://schemas.microsoft.com/office/drawing/2016/5/13/chartex" xmlns:cx8="http://schemas.microsoft.com/office/drawing/2016/5/14/chartex" xmlns:mc="http://schemas.openxmlformats.org/markup-compatibility/2006" xmlns:aink="http://schemas.microsoft.com/office/drawing/2016/ink" xmlns:am3d="http://schemas.microsoft.com/office/drawing/2017/model3d" xmlns:o="urn:schemas-microsoft-com:office:office" xmlns:oel="http://schemas.microsoft.com/office/2019/extlst" xmlns:r="http://schemas.openxmlformats.org/officeDocument/2006/relationships" xmlns:m="http://schemas.openxmlformats.org/officeDocument/2006/math" xmlns:v="urn:schemas-microsoft-com:vml" xmlns:wp14="http://schemas.microsoft.com/office/word/2010/wordprocessingDrawing" xmlns:wp="http://schemas.openxmlformats.org/drawingml/2006/wordprocessingDrawing" xmlns:w10="urn:schemas-microsoft-com:office:word" xmlns:w="http://schemas.openxmlformats.org/wordprocessingml/2006/main" xmlns:w14="http://schemas.microsoft.com/office/word/2010/wordml" xmlns:w15="http://schemas.microsoft.com/office/word/2012/wordml" xmlns:w16cex="http://schemas.microsoft.com/office/word/2018/wordml/cex" xmlns:w16cid="http://schemas.microsoft.com/office/word/2016/wordml/cid" xmlns:w16="http://schemas.microsoft.com/office/word/2018/wordml" xmlns:w16du="http://schemas.microsoft.com/office/word/2023/wordml/word16du" xmlns:w16sdtdh="http://schemas.microsoft.com/office/word/2020/wordml/sdtdatahash" xmlns:w16sdtfl="http://schemas.microsoft.com/office/word/2024/wordml/sdtformatlock" xmlns:w16se="http://schemas.microsoft.com/office/word/2015/wordml/symex" xmlns:wpg="http://schemas.microsoft.com/office/word/2010/wordprocessingGroup" xmlns:wpi="http://schemas.microsoft.com/office/word/2010/wordprocessingInk" xmlns:wne="http://schemas.microsoft.com/office/word/2006/wordml" xmlns:wps="http://schemas.microsoft.com/office/word/2010/wordprocessingShape" mc:Ignorable="w14 w15 w16se w16cid w16 w16cex w16sdtdh w16sdtfl w16du wp14">
+<w:ftr xmlns:wpc="http://schemas.microsoft.com/office/word/2010/wordprocessingCanvas" xmlns:cx="http://schemas.microsoft.com/office/drawing/2014/chartex" xmlns:cx1="http://schemas.microsoft.com/office/drawing/2015/9/8/chartex" xmlns:cx2="http://schemas.microsoft.com/office/drawing/2015/10/21/chartex" xmlns:cx3="http://schemas.microsoft.com/office/drawing/2016/5/9/chartex" xmlns:cx4="http://schemas.microsoft.com/office/drawing/2016/5/10/chartex" xmlns:cx5="http://schemas.microsoft.com/office/drawing/2016/5/11/chartex" xmlns:cx6="http://schemas.microsoft.com/office/drawing/2016/5/12/chartex" xmlns:cx7="http://schemas.microsoft.com/office/drawing/2016/5/13/chartex" xmlns:cx8="http://schemas.microsoft.com/office/drawing/2016/5/14/chartex" xmlns:mc="http://schemas.openxmlformats.org/markup-compatibility/2006" xmlns:aink="http://schemas.microsoft.com/office/drawing/2016/ink" xmlns:am3d="http://schemas.microsoft.com/office/drawing/2017/model3d" xmlns:o="urn:schemas-microsoft-com:office:office" xmlns:oel="http://schemas.microsoft.com/office/2019/extlst" xmlns:r="http://schemas.openxmlformats.org/officeDocument/2006/relationships" xmlns:m="http://schemas.openxmlformats.org/officeDocument/2006/math" xmlns:v="urn:schemas-microsoft-com:vml" xmlns:wp14="http://schemas.microsoft.com/office/word/2010/wordprocessingDrawing" xmlns:wp="http://schemas.openxmlformats.org/drawingml/2006/wordprocessingDrawing" xmlns:w10="urn:schemas-microsoft-com:office:word" xmlns:w="http://schemas.openxmlformats.org/wordprocessingml/2006/main" xmlns:w14="http://schemas.microsoft.com/office/word/2010/wordml" xmlns:w15="http://schemas.microsoft.com/office/word/2012/wordml" xmlns:w16cei="http://schemas.microsoft.com/office/word/2026/wordml/cei" xmlns:w16cex="http://schemas.microsoft.com/office/word/2018/wordml/cex" xmlns:w16cid="http://schemas.microsoft.com/office/word/2016/wordml/cid" xmlns:w16="http://schemas.microsoft.com/office/word/2018/wordml" xmlns:w16du="http://schemas.microsoft.com/office/word/2023/wordml/word16du" xmlns:w16sdtdh="http://schemas.microsoft.com/office/word/2020/wordml/sdtdatahash" xmlns:w16sdtfl="http://schemas.microsoft.com/office/word/2024/wordml/sdtformatlock" xmlns:w16se="http://schemas.microsoft.com/office/word/2015/wordml/symex" xmlns:wpg="http://schemas.microsoft.com/office/word/2010/wordprocessingGroup" xmlns:wpi="http://schemas.microsoft.com/office/word/2010/wordprocessingInk" xmlns:wne="http://schemas.microsoft.com/office/word/2006/wordml" xmlns:wps="http://schemas.microsoft.com/office/word/2010/wordprocessingShape" mc:Ignorable="w14 w15 w16se w16cid w16 w16cex w16sdtdh w16sdtfl w16du wp14">
   <w:p>
     <w:pPr>
       <w:pStyle w:val="Footer"/>
@@ -3238,7 +3568,7 @@
 </file>
 
 <file path=word/footer2.xml><?xml version="1.0" encoding="utf-8"?>
-<w:ftr xmlns:wpc="http://schemas.microsoft.com/office/word/2010/wordprocessingCanvas" xmlns:cx="http://schemas.microsoft.com/office/drawing/2014/chartex" xmlns:cx1="http://schemas.microsoft.com/office/drawing/2015/9/8/chartex" xmlns:cx2="http://schemas.microsoft.com/office/drawing/2015/10/21/chartex" xmlns:cx3="http://schemas.microsoft.com/office/drawing/2016/5/9/chartex" xmlns:cx4="http://schemas.microsoft.com/office/drawing/2016/5/10/chartex" xmlns:cx5="http://schemas.microsoft.com/office/drawing/2016/5/11/chartex" xmlns:cx6="http://schemas.microsoft.com/office/drawing/2016/5/12/chartex" xmlns:cx7="http://schemas.microsoft.com/office/drawing/2016/5/13/chartex" xmlns:cx8="http://schemas.microsoft.com/office/drawing/2016/5/14/chartex" xmlns:mc="http://schemas.openxmlformats.org/markup-compatibility/2006" xmlns:aink="http://schemas.microsoft.com/office/drawing/2016/ink" xmlns:am3d="http://schemas.microsoft.com/office/drawing/2017/model3d" xmlns:o="urn:schemas-microsoft-com:office:office" xmlns:oel="http://schemas.microsoft.com/office/2019/extlst" xmlns:r="http://schemas.openxmlformats.org/officeDocument/2006/relationships" xmlns:m="http://schemas.openxmlformats.org/officeDocument/2006/math" xmlns:v="urn:schemas-microsoft-com:vml" xmlns:wp14="http://schemas.microsoft.com/office/word/2010/wordprocessingDrawing" xmlns:wp="http://schemas.openxmlformats.org/drawingml/2006/wordprocessingDrawing" xmlns:w10="urn:schemas-microsoft-com:office:word" xmlns:w="http://schemas.openxmlformats.org/wordprocessingml/2006/main" xmlns:w14="http://schemas.microsoft.com/office/word/2010/wordml" xmlns:w15="http://schemas.microsoft.com/office/word/2012/wordml" xmlns:w16cex="http://schemas.microsoft.com/office/word/2018/wordml/cex" xmlns:w16cid="http://schemas.microsoft.com/office/word/2016/wordml/cid" xmlns:w16="http://schemas.microsoft.com/office/word/2018/wordml" xmlns:w16du="http://schemas.microsoft.com/office/word/2023/wordml/word16du" xmlns:w16sdtdh="http://schemas.microsoft.com/office/word/2020/wordml/sdtdatahash" xmlns:w16sdtfl="http://schemas.microsoft.com/office/word/2024/wordml/sdtformatlock" xmlns:w16se="http://schemas.microsoft.com/office/word/2015/wordml/symex" xmlns:wpg="http://schemas.microsoft.com/office/word/2010/wordprocessingGroup" xmlns:wpi="http://schemas.microsoft.com/office/word/2010/wordprocessingInk" xmlns:wne="http://schemas.microsoft.com/office/word/2006/wordml" xmlns:wps="http://schemas.microsoft.com/office/word/2010/wordprocessingShape" mc:Ignorable="w14 w15 w16se w16cid w16 w16cex w16sdtdh w16sdtfl w16du wp14">
+<w:ftr xmlns:wpc="http://schemas.microsoft.com/office/word/2010/wordprocessingCanvas" xmlns:cx="http://schemas.microsoft.com/office/drawing/2014/chartex" xmlns:cx1="http://schemas.microsoft.com/office/drawing/2015/9/8/chartex" xmlns:cx2="http://schemas.microsoft.com/office/drawing/2015/10/21/chartex" xmlns:cx3="http://schemas.microsoft.com/office/drawing/2016/5/9/chartex" xmlns:cx4="http://schemas.microsoft.com/office/drawing/2016/5/10/chartex" xmlns:cx5="http://schemas.microsoft.com/office/drawing/2016/5/11/chartex" xmlns:cx6="http://schemas.microsoft.com/office/drawing/2016/5/12/chartex" xmlns:cx7="http://schemas.microsoft.com/office/drawing/2016/5/13/chartex" xmlns:cx8="http://schemas.microsoft.com/office/drawing/2016/5/14/chartex" xmlns:mc="http://schemas.openxmlformats.org/markup-compatibility/2006" xmlns:aink="http://schemas.microsoft.com/office/drawing/2016/ink" xmlns:am3d="http://schemas.microsoft.com/office/drawing/2017/model3d" xmlns:o="urn:schemas-microsoft-com:office:office" xmlns:oel="http://schemas.microsoft.com/office/2019/extlst" xmlns:r="http://schemas.openxmlformats.org/officeDocument/2006/relationships" xmlns:m="http://schemas.openxmlformats.org/officeDocument/2006/math" xmlns:v="urn:schemas-microsoft-com:vml" xmlns:wp14="http://schemas.microsoft.com/office/word/2010/wordprocessingDrawing" xmlns:wp="http://schemas.openxmlformats.org/drawingml/2006/wordprocessingDrawing" xmlns:w10="urn:schemas-microsoft-com:office:word" xmlns:w="http://schemas.openxmlformats.org/wordprocessingml/2006/main" xmlns:w14="http://schemas.microsoft.com/office/word/2010/wordml" xmlns:w15="http://schemas.microsoft.com/office/word/2012/wordml" xmlns:w16cei="http://schemas.microsoft.com/office/word/2026/wordml/cei" xmlns:w16cex="http://schemas.microsoft.com/office/word/2018/wordml/cex" xmlns:w16cid="http://schemas.microsoft.com/office/word/2016/wordml/cid" xmlns:w16="http://schemas.microsoft.com/office/word/2018/wordml" xmlns:w16du="http://schemas.microsoft.com/office/word/2023/wordml/word16du" xmlns:w16sdtdh="http://schemas.microsoft.com/office/word/2020/wordml/sdtdatahash" xmlns:w16sdtfl="http://schemas.microsoft.com/office/word/2024/wordml/sdtformatlock" xmlns:w16se="http://schemas.microsoft.com/office/word/2015/wordml/symex" xmlns:wpg="http://schemas.microsoft.com/office/word/2010/wordprocessingGroup" xmlns:wpi="http://schemas.microsoft.com/office/word/2010/wordprocessingInk" xmlns:wne="http://schemas.microsoft.com/office/word/2006/wordml" xmlns:wps="http://schemas.microsoft.com/office/word/2010/wordprocessingShape" mc:Ignorable="w14 w15 w16se w16cid w16 w16cex w16sdtdh w16sdtfl w16du wp14">
   <w:sdt>
     <w:sdtPr>
       <w:id w:val="1598591495"/>
@@ -3286,7 +3616,7 @@
 </file>
 
 <file path=word/footer3.xml><?xml version="1.0" encoding="utf-8"?>
-<w:ftr xmlns:wpc="http://schemas.microsoft.com/office/word/2010/wordprocessingCanvas" xmlns:cx="http://schemas.microsoft.com/office/drawing/2014/chartex" xmlns:cx1="http://schemas.microsoft.com/office/drawing/2015/9/8/chartex" xmlns:cx2="http://schemas.microsoft.com/office/drawing/2015/10/21/chartex" xmlns:cx3="http://schemas.microsoft.com/office/drawing/2016/5/9/chartex" xmlns:cx4="http://schemas.microsoft.com/office/drawing/2016/5/10/chartex" xmlns:cx5="http://schemas.microsoft.com/office/drawing/2016/5/11/chartex" xmlns:cx6="http://schemas.microsoft.com/office/drawing/2016/5/12/chartex" xmlns:cx7="http://schemas.microsoft.com/office/drawing/2016/5/13/chartex" xmlns:cx8="http://schemas.microsoft.com/office/drawing/2016/5/14/chartex" xmlns:mc="http://schemas.openxmlformats.org/markup-compatibility/2006" xmlns:aink="http://schemas.microsoft.com/office/drawing/2016/ink" xmlns:am3d="http://schemas.microsoft.com/office/drawing/2017/model3d" xmlns:o="urn:schemas-microsoft-com:office:office" xmlns:oel="http://schemas.microsoft.com/office/2019/extlst" xmlns:r="http://schemas.openxmlformats.org/officeDocument/2006/relationships" xmlns:m="http://schemas.openxmlformats.org/officeDocument/2006/math" xmlns:v="urn:schemas-microsoft-com:vml" xmlns:wp14="http://schemas.microsoft.com/office/word/2010/wordprocessingDrawing" xmlns:wp="http://schemas.openxmlformats.org/drawingml/2006/wordprocessingDrawing" xmlns:w10="urn:schemas-microsoft-com:office:word" xmlns:w="http://schemas.openxmlformats.org/wordprocessingml/2006/main" xmlns:w14="http://schemas.microsoft.com/office/word/2010/wordml" xmlns:w15="http://schemas.microsoft.com/office/word/2012/wordml" xmlns:w16cex="http://schemas.microsoft.com/office/word/2018/wordml/cex" xmlns:w16cid="http://schemas.microsoft.com/office/word/2016/wordml/cid" xmlns:w16="http://schemas.microsoft.com/office/word/2018/wordml" xmlns:w16du="http://schemas.microsoft.com/office/word/2023/wordml/word16du" xmlns:w16sdtdh="http://schemas.microsoft.com/office/word/2020/wordml/sdtdatahash" xmlns:w16sdtfl="http://schemas.microsoft.com/office/word/2024/wordml/sdtformatlock" xmlns:w16se="http://schemas.microsoft.com/office/word/2015/wordml/symex" xmlns:wpg="http://schemas.microsoft.com/office/word/2010/wordprocessingGroup" xmlns:wpi="http://schemas.microsoft.com/office/word/2010/wordprocessingInk" xmlns:wne="http://schemas.microsoft.com/office/word/2006/wordml" xmlns:wps="http://schemas.microsoft.com/office/word/2010/wordprocessingShape" mc:Ignorable="w14 w15 w16se w16cid w16 w16cex w16sdtdh w16sdtfl w16du wp14">
+<w:ftr xmlns:wpc="http://schemas.microsoft.com/office/word/2010/wordprocessingCanvas" xmlns:cx="http://schemas.microsoft.com/office/drawing/2014/chartex" xmlns:cx1="http://schemas.microsoft.com/office/drawing/2015/9/8/chartex" xmlns:cx2="http://schemas.microsoft.com/office/drawing/2015/10/21/chartex" xmlns:cx3="http://schemas.microsoft.com/office/drawing/2016/5/9/chartex" xmlns:cx4="http://schemas.microsoft.com/office/drawing/2016/5/10/chartex" xmlns:cx5="http://schemas.microsoft.com/office/drawing/2016/5/11/chartex" xmlns:cx6="http://schemas.microsoft.com/office/drawing/2016/5/12/chartex" xmlns:cx7="http://schemas.microsoft.com/office/drawing/2016/5/13/chartex" xmlns:cx8="http://schemas.microsoft.com/office/drawing/2016/5/14/chartex" xmlns:mc="http://schemas.openxmlformats.org/markup-compatibility/2006" xmlns:aink="http://schemas.microsoft.com/office/drawing/2016/ink" xmlns:am3d="http://schemas.microsoft.com/office/drawing/2017/model3d" xmlns:o="urn:schemas-microsoft-com:office:office" xmlns:oel="http://schemas.microsoft.com/office/2019/extlst" xmlns:r="http://schemas.openxmlformats.org/officeDocument/2006/relationships" xmlns:m="http://schemas.openxmlformats.org/officeDocument/2006/math" xmlns:v="urn:schemas-microsoft-com:vml" xmlns:wp14="http://schemas.microsoft.com/office/word/2010/wordprocessingDrawing" xmlns:wp="http://schemas.openxmlformats.org/drawingml/2006/wordprocessingDrawing" xmlns:w10="urn:schemas-microsoft-com:office:word" xmlns:w="http://schemas.openxmlformats.org/wordprocessingml/2006/main" xmlns:w14="http://schemas.microsoft.com/office/word/2010/wordml" xmlns:w15="http://schemas.microsoft.com/office/word/2012/wordml" xmlns:w16cei="http://schemas.microsoft.com/office/word/2026/wordml/cei" xmlns:w16cex="http://schemas.microsoft.com/office/word/2018/wordml/cex" xmlns:w16cid="http://schemas.microsoft.com/office/word/2016/wordml/cid" xmlns:w16="http://schemas.microsoft.com/office/word/2018/wordml" xmlns:w16du="http://schemas.microsoft.com/office/word/2023/wordml/word16du" xmlns:w16sdtdh="http://schemas.microsoft.com/office/word/2020/wordml/sdtdatahash" xmlns:w16sdtfl="http://schemas.microsoft.com/office/word/2024/wordml/sdtformatlock" xmlns:w16se="http://schemas.microsoft.com/office/word/2015/wordml/symex" xmlns:wpg="http://schemas.microsoft.com/office/word/2010/wordprocessingGroup" xmlns:wpi="http://schemas.microsoft.com/office/word/2010/wordprocessingInk" xmlns:wne="http://schemas.microsoft.com/office/word/2006/wordml" xmlns:wps="http://schemas.microsoft.com/office/word/2010/wordprocessingShape" mc:Ignorable="w14 w15 w16se w16cid w16 w16cex w16sdtdh w16sdtfl w16du wp14">
   <w:p>
     <w:pPr>
       <w:pStyle w:val="Footer"/>
@@ -3296,7 +3626,7 @@
 </file>
 
 <file path=word/footnotes.xml><?xml version="1.0" encoding="utf-8"?>
-<w:footnotes xmlns:wpc="http://schemas.microsoft.com/office/word/2010/wordprocessingCanvas" xmlns:cx="http://schemas.microsoft.com/office/drawing/2014/chartex" xmlns:cx1="http://schemas.microsoft.com/office/drawing/2015/9/8/chartex" xmlns:cx2="http://schemas.microsoft.com/office/drawing/2015/10/21/chartex" xmlns:cx3="http://schemas.microsoft.com/office/drawing/2016/5/9/chartex" xmlns:cx4="http://schemas.microsoft.com/office/drawing/2016/5/10/chartex" xmlns:cx5="http://schemas.microsoft.com/office/drawing/2016/5/11/chartex" xmlns:cx6="http://schemas.microsoft.com/office/drawing/2016/5/12/chartex" xmlns:cx7="http://schemas.microsoft.com/office/drawing/2016/5/13/chartex" xmlns:cx8="http://schemas.microsoft.com/office/drawing/2016/5/14/chartex" xmlns:mc="http://schemas.openxmlformats.org/markup-compatibility/2006" xmlns:aink="http://schemas.microsoft.com/office/drawing/2016/ink" xmlns:am3d="http://schemas.microsoft.com/office/drawing/2017/model3d" xmlns:o="urn:schemas-microsoft-com:office:office" xmlns:oel="http://schemas.microsoft.com/office/2019/extlst" xmlns:r="http://schemas.openxmlformats.org/officeDocument/2006/relationships" xmlns:m="http://schemas.openxmlformats.org/officeDocument/2006/math" xmlns:v="urn:schemas-microsoft-com:vml" xmlns:wp14="http://schemas.microsoft.com/office/word/2010/wordprocessingDrawing" xmlns:wp="http://schemas.openxmlformats.org/drawingml/2006/wordprocessingDrawing" xmlns:w10="urn:schemas-microsoft-com:office:word" xmlns:w="http://schemas.openxmlformats.org/wordprocessingml/2006/main" xmlns:w14="http://schemas.microsoft.com/office/word/2010/wordml" xmlns:w15="http://schemas.microsoft.com/office/word/2012/wordml" xmlns:w16cex="http://schemas.microsoft.com/office/word/2018/wordml/cex" xmlns:w16cid="http://schemas.microsoft.com/office/word/2016/wordml/cid" xmlns:w16="http://schemas.microsoft.com/office/word/2018/wordml" xmlns:w16du="http://schemas.microsoft.com/office/word/2023/wordml/word16du" xmlns:w16sdtdh="http://schemas.microsoft.com/office/word/2020/wordml/sdtdatahash" xmlns:w16sdtfl="http://schemas.microsoft.com/office/word/2024/wordml/sdtformatlock" xmlns:w16se="http://schemas.microsoft.com/office/word/2015/wordml/symex" xmlns:wpg="http://schemas.microsoft.com/office/word/2010/wordprocessingGroup" xmlns:wpi="http://schemas.microsoft.com/office/word/2010/wordprocessingInk" xmlns:wne="http://schemas.microsoft.com/office/word/2006/wordml" xmlns:wps="http://schemas.microsoft.com/office/word/2010/wordprocessingShape" mc:Ignorable="w14 w15 w16se w16cid w16 w16cex w16sdtdh w16sdtfl w16du wp14">
+<w:footnotes xmlns:wpc="http://schemas.microsoft.com/office/word/2010/wordprocessingCanvas" xmlns:cx="http://schemas.microsoft.com/office/drawing/2014/chartex" xmlns:cx1="http://schemas.microsoft.com/office/drawing/2015/9/8/chartex" xmlns:cx2="http://schemas.microsoft.com/office/drawing/2015/10/21/chartex" xmlns:cx3="http://schemas.microsoft.com/office/drawing/2016/5/9/chartex" xmlns:cx4="http://schemas.microsoft.com/office/drawing/2016/5/10/chartex" xmlns:cx5="http://schemas.microsoft.com/office/drawing/2016/5/11/chartex" xmlns:cx6="http://schemas.microsoft.com/office/drawing/2016/5/12/chartex" xmlns:cx7="http://schemas.microsoft.com/office/drawing/2016/5/13/chartex" xmlns:cx8="http://schemas.microsoft.com/office/drawing/2016/5/14/chartex" xmlns:mc="http://schemas.openxmlformats.org/markup-compatibility/2006" xmlns:aink="http://schemas.microsoft.com/office/drawing/2016/ink" xmlns:am3d="http://schemas.microsoft.com/office/drawing/2017/model3d" xmlns:o="urn:schemas-microsoft-com:office:office" xmlns:oel="http://schemas.microsoft.com/office/2019/extlst" xmlns:r="http://schemas.openxmlformats.org/officeDocument/2006/relationships" xmlns:m="http://schemas.openxmlformats.org/officeDocument/2006/math" xmlns:v="urn:schemas-microsoft-com:vml" xmlns:wp14="http://schemas.microsoft.com/office/word/2010/wordprocessingDrawing" xmlns:wp="http://schemas.openxmlformats.org/drawingml/2006/wordprocessingDrawing" xmlns:w10="urn:schemas-microsoft-com:office:word" xmlns:w="http://schemas.openxmlformats.org/wordprocessingml/2006/main" xmlns:w14="http://schemas.microsoft.com/office/word/2010/wordml" xmlns:w15="http://schemas.microsoft.com/office/word/2012/wordml" xmlns:w16cei="http://schemas.microsoft.com/office/word/2026/wordml/cei" xmlns:w16cex="http://schemas.microsoft.com/office/word/2018/wordml/cex" xmlns:w16cid="http://schemas.microsoft.com/office/word/2016/wordml/cid" xmlns:w16="http://schemas.microsoft.com/office/word/2018/wordml" xmlns:w16du="http://schemas.microsoft.com/office/word/2023/wordml/word16du" xmlns:w16sdtdh="http://schemas.microsoft.com/office/word/2020/wordml/sdtdatahash" xmlns:w16sdtfl="http://schemas.microsoft.com/office/word/2024/wordml/sdtformatlock" xmlns:w16se="http://schemas.microsoft.com/office/word/2015/wordml/symex" xmlns:wpg="http://schemas.microsoft.com/office/word/2010/wordprocessingGroup" xmlns:wpi="http://schemas.microsoft.com/office/word/2010/wordprocessingInk" xmlns:wne="http://schemas.microsoft.com/office/word/2006/wordml" xmlns:wps="http://schemas.microsoft.com/office/word/2010/wordprocessingShape" mc:Ignorable="w14 w15 w16se w16cid w16 w16cex w16sdtdh w16sdtfl w16du wp14">
   <w:footnote w:type="separator" w:id="-1">
     <w:p>
       <w:pPr>
@@ -3537,7 +3867,7 @@
 </file>
 
 <file path=word/header1.xml><?xml version="1.0" encoding="utf-8"?>
-<w:hdr xmlns:wpc="http://schemas.microsoft.com/office/word/2010/wordprocessingCanvas" xmlns:cx="http://schemas.microsoft.com/office/drawing/2014/chartex" xmlns:cx1="http://schemas.microsoft.com/office/drawing/2015/9/8/chartex" xmlns:cx2="http://schemas.microsoft.com/office/drawing/2015/10/21/chartex" xmlns:cx3="http://schemas.microsoft.com/office/drawing/2016/5/9/chartex" xmlns:cx4="http://schemas.microsoft.com/office/drawing/2016/5/10/chartex" xmlns:cx5="http://schemas.microsoft.com/office/drawing/2016/5/11/chartex" xmlns:cx6="http://schemas.microsoft.com/office/drawing/2016/5/12/chartex" xmlns:cx7="http://schemas.microsoft.com/office/drawing/2016/5/13/chartex" xmlns:cx8="http://schemas.microsoft.com/office/drawing/2016/5/14/chartex" xmlns:mc="http://schemas.openxmlformats.org/markup-compatibility/2006" xmlns:aink="http://schemas.microsoft.com/office/drawing/2016/ink" xmlns:am3d="http://schemas.microsoft.com/office/drawing/2017/model3d" xmlns:o="urn:schemas-microsoft-com:office:office" xmlns:oel="http://schemas.microsoft.com/office/2019/extlst" xmlns:r="http://schemas.openxmlformats.org/officeDocument/2006/relationships" xmlns:m="http://schemas.openxmlformats.org/officeDocument/2006/math" xmlns:v="urn:schemas-microsoft-com:vml" xmlns:wp14="http://schemas.microsoft.com/office/word/2010/wordprocessingDrawing" xmlns:wp="http://schemas.openxmlformats.org/drawingml/2006/wordprocessingDrawing" xmlns:w10="urn:schemas-microsoft-com:office:word" xmlns:w="http://schemas.openxmlformats.org/wordprocessingml/2006/main" xmlns:w14="http://schemas.microsoft.com/office/word/2010/wordml" xmlns:w15="http://schemas.microsoft.com/office/word/2012/wordml" xmlns:w16cex="http://schemas.microsoft.com/office/word/2018/wordml/cex" xmlns:w16cid="http://schemas.microsoft.com/office/word/2016/wordml/cid" xmlns:w16="http://schemas.microsoft.com/office/word/2018/wordml" xmlns:w16du="http://schemas.microsoft.com/office/word/2023/wordml/word16du" xmlns:w16sdtdh="http://schemas.microsoft.com/office/word/2020/wordml/sdtdatahash" xmlns:w16sdtfl="http://schemas.microsoft.com/office/word/2024/wordml/sdtformatlock" xmlns:w16se="http://schemas.microsoft.com/office/word/2015/wordml/symex" xmlns:wpg="http://schemas.microsoft.com/office/word/2010/wordprocessingGroup" xmlns:wpi="http://schemas.microsoft.com/office/word/2010/wordprocessingInk" xmlns:wne="http://schemas.microsoft.com/office/word/2006/wordml" xmlns:wps="http://schemas.microsoft.com/office/word/2010/wordprocessingShape" mc:Ignorable="w14 w15 w16se w16cid w16 w16cex w16sdtdh w16sdtfl w16du wp14">
+<w:hdr xmlns:wpc="http://schemas.microsoft.com/office/word/2010/wordprocessingCanvas" xmlns:cx="http://schemas.microsoft.com/office/drawing/2014/chartex" xmlns:cx1="http://schemas.microsoft.com/office/drawing/2015/9/8/chartex" xmlns:cx2="http://schemas.microsoft.com/office/drawing/2015/10/21/chartex" xmlns:cx3="http://schemas.microsoft.com/office/drawing/2016/5/9/chartex" xmlns:cx4="http://schemas.microsoft.com/office/drawing/2016/5/10/chartex" xmlns:cx5="http://schemas.microsoft.com/office/drawing/2016/5/11/chartex" xmlns:cx6="http://schemas.microsoft.com/office/drawing/2016/5/12/chartex" xmlns:cx7="http://schemas.microsoft.com/office/drawing/2016/5/13/chartex" xmlns:cx8="http://schemas.microsoft.com/office/drawing/2016/5/14/chartex" xmlns:mc="http://schemas.openxmlformats.org/markup-compatibility/2006" xmlns:aink="http://schemas.microsoft.com/office/drawing/2016/ink" xmlns:am3d="http://schemas.microsoft.com/office/drawing/2017/model3d" xmlns:o="urn:schemas-microsoft-com:office:office" xmlns:oel="http://schemas.microsoft.com/office/2019/extlst" xmlns:r="http://schemas.openxmlformats.org/officeDocument/2006/relationships" xmlns:m="http://schemas.openxmlformats.org/officeDocument/2006/math" xmlns:v="urn:schemas-microsoft-com:vml" xmlns:wp14="http://schemas.microsoft.com/office/word/2010/wordprocessingDrawing" xmlns:wp="http://schemas.openxmlformats.org/drawingml/2006/wordprocessingDrawing" xmlns:w10="urn:schemas-microsoft-com:office:word" xmlns:w="http://schemas.openxmlformats.org/wordprocessingml/2006/main" xmlns:w14="http://schemas.microsoft.com/office/word/2010/wordml" xmlns:w15="http://schemas.microsoft.com/office/word/2012/wordml" xmlns:w16cei="http://schemas.microsoft.com/office/word/2026/wordml/cei" xmlns:w16cex="http://schemas.microsoft.com/office/word/2018/wordml/cex" xmlns:w16cid="http://schemas.microsoft.com/office/word/2016/wordml/cid" xmlns:w16="http://schemas.microsoft.com/office/word/2018/wordml" xmlns:w16du="http://schemas.microsoft.com/office/word/2023/wordml/word16du" xmlns:w16sdtdh="http://schemas.microsoft.com/office/word/2020/wordml/sdtdatahash" xmlns:w16sdtfl="http://schemas.microsoft.com/office/word/2024/wordml/sdtformatlock" xmlns:w16se="http://schemas.microsoft.com/office/word/2015/wordml/symex" xmlns:wpg="http://schemas.microsoft.com/office/word/2010/wordprocessingGroup" xmlns:wpi="http://schemas.microsoft.com/office/word/2010/wordprocessingInk" xmlns:wne="http://schemas.microsoft.com/office/word/2006/wordml" xmlns:wps="http://schemas.microsoft.com/office/word/2010/wordprocessingShape" mc:Ignorable="w14 w15 w16se w16cid w16 w16cex w16sdtdh w16sdtfl w16du wp14">
   <w:p>
     <w:pPr>
       <w:pStyle w:val="Header"/>
@@ -3547,7 +3877,7 @@
 </file>
 
 <file path=word/header2.xml><?xml version="1.0" encoding="utf-8"?>
-<w:hdr xmlns:wpc="http://schemas.microsoft.com/office/word/2010/wordprocessingCanvas" xmlns:cx="http://schemas.microsoft.com/office/drawing/2014/chartex" xmlns:cx1="http://schemas.microsoft.com/office/drawing/2015/9/8/chartex" xmlns:cx2="http://schemas.microsoft.com/office/drawing/2015/10/21/chartex" xmlns:cx3="http://schemas.microsoft.com/office/drawing/2016/5/9/chartex" xmlns:cx4="http://schemas.microsoft.com/office/drawing/2016/5/10/chartex" xmlns:cx5="http://schemas.microsoft.com/office/drawing/2016/5/11/chartex" xmlns:cx6="http://schemas.microsoft.com/office/drawing/2016/5/12/chartex" xmlns:cx7="http://schemas.microsoft.com/office/drawing/2016/5/13/chartex" xmlns:cx8="http://schemas.microsoft.com/office/drawing/2016/5/14/chartex" xmlns:mc="http://schemas.openxmlformats.org/markup-compatibility/2006" xmlns:aink="http://schemas.microsoft.com/office/drawing/2016/ink" xmlns:am3d="http://schemas.microsoft.com/office/drawing/2017/model3d" xmlns:o="urn:schemas-microsoft-com:office:office" xmlns:oel="http://schemas.microsoft.com/office/2019/extlst" xmlns:r="http://schemas.openxmlformats.org/officeDocument/2006/relationships" xmlns:m="http://schemas.openxmlformats.org/officeDocument/2006/math" xmlns:v="urn:schemas-microsoft-com:vml" xmlns:wp14="http://schemas.microsoft.com/office/word/2010/wordprocessingDrawing" xmlns:wp="http://schemas.openxmlformats.org/drawingml/2006/wordprocessingDrawing" xmlns:w10="urn:schemas-microsoft-com:office:word" xmlns:w="http://schemas.openxmlformats.org/wordprocessingml/2006/main" xmlns:w14="http://schemas.microsoft.com/office/word/2010/wordml" xmlns:w15="http://schemas.microsoft.com/office/word/2012/wordml" xmlns:w16cex="http://schemas.microsoft.com/office/word/2018/wordml/cex" xmlns:w16cid="http://schemas.microsoft.com/office/word/2016/wordml/cid" xmlns:w16="http://schemas.microsoft.com/office/word/2018/wordml" xmlns:w16du="http://schemas.microsoft.com/office/word/2023/wordml/word16du" xmlns:w16sdtdh="http://schemas.microsoft.com/office/word/2020/wordml/sdtdatahash" xmlns:w16sdtfl="http://schemas.microsoft.com/office/word/2024/wordml/sdtformatlock" xmlns:w16se="http://schemas.microsoft.com/office/word/2015/wordml/symex" xmlns:wpg="http://schemas.microsoft.com/office/word/2010/wordprocessingGroup" xmlns:wpi="http://schemas.microsoft.com/office/word/2010/wordprocessingInk" xmlns:wne="http://schemas.microsoft.com/office/word/2006/wordml" xmlns:wps="http://schemas.microsoft.com/office/word/2010/wordprocessingShape" mc:Ignorable="w14 w15 w16se w16cid w16 w16cex w16sdtdh w16sdtfl w16du wp14">
+<w:hdr xmlns:wpc="http://schemas.microsoft.com/office/word/2010/wordprocessingCanvas" xmlns:cx="http://schemas.microsoft.com/office/drawing/2014/chartex" xmlns:cx1="http://schemas.microsoft.com/office/drawing/2015/9/8/chartex" xmlns:cx2="http://schemas.microsoft.com/office/drawing/2015/10/21/chartex" xmlns:cx3="http://schemas.microsoft.com/office/drawing/2016/5/9/chartex" xmlns:cx4="http://schemas.microsoft.com/office/drawing/2016/5/10/chartex" xmlns:cx5="http://schemas.microsoft.com/office/drawing/2016/5/11/chartex" xmlns:cx6="http://schemas.microsoft.com/office/drawing/2016/5/12/chartex" xmlns:cx7="http://schemas.microsoft.com/office/drawing/2016/5/13/chartex" xmlns:cx8="http://schemas.microsoft.com/office/drawing/2016/5/14/chartex" xmlns:mc="http://schemas.openxmlformats.org/markup-compatibility/2006" xmlns:aink="http://schemas.microsoft.com/office/drawing/2016/ink" xmlns:am3d="http://schemas.microsoft.com/office/drawing/2017/model3d" xmlns:o="urn:schemas-microsoft-com:office:office" xmlns:oel="http://schemas.microsoft.com/office/2019/extlst" xmlns:r="http://schemas.openxmlformats.org/officeDocument/2006/relationships" xmlns:m="http://schemas.openxmlformats.org/officeDocument/2006/math" xmlns:v="urn:schemas-microsoft-com:vml" xmlns:wp14="http://schemas.microsoft.com/office/word/2010/wordprocessingDrawing" xmlns:wp="http://schemas.openxmlformats.org/drawingml/2006/wordprocessingDrawing" xmlns:w10="urn:schemas-microsoft-com:office:word" xmlns:w="http://schemas.openxmlformats.org/wordprocessingml/2006/main" xmlns:w14="http://schemas.microsoft.com/office/word/2010/wordml" xmlns:w15="http://schemas.microsoft.com/office/word/2012/wordml" xmlns:w16cei="http://schemas.microsoft.com/office/word/2026/wordml/cei" xmlns:w16cex="http://schemas.microsoft.com/office/word/2018/wordml/cex" xmlns:w16cid="http://schemas.microsoft.com/office/word/2016/wordml/cid" xmlns:w16="http://schemas.microsoft.com/office/word/2018/wordml" xmlns:w16du="http://schemas.microsoft.com/office/word/2023/wordml/word16du" xmlns:w16sdtdh="http://schemas.microsoft.com/office/word/2020/wordml/sdtdatahash" xmlns:w16sdtfl="http://schemas.microsoft.com/office/word/2024/wordml/sdtformatlock" xmlns:w16se="http://schemas.microsoft.com/office/word/2015/wordml/symex" xmlns:wpg="http://schemas.microsoft.com/office/word/2010/wordprocessingGroup" xmlns:wpi="http://schemas.microsoft.com/office/word/2010/wordprocessingInk" xmlns:wne="http://schemas.microsoft.com/office/word/2006/wordml" xmlns:wps="http://schemas.microsoft.com/office/word/2010/wordprocessingShape" mc:Ignorable="w14 w15 w16se w16cid w16 w16cex w16sdtdh w16sdtfl w16du wp14">
   <w:p>
     <w:pPr>
       <w:pStyle w:val="Header"/>
@@ -3568,7 +3898,7 @@
       <w:t>2</w:t>
     </w:r>
     <w:r>
-      <w:t>2</w:t>
+      <w:t>3</w:t>
     </w:r>
     <w:r>
       <w:tab/>
@@ -3577,7 +3907,7 @@
       <w:tab/>
     </w:r>
     <w:r>
-      <w:t>7/20</w:t>
+      <w:t>8/17</w:t>
     </w:r>
     <w:r>
       <w:t>/2026</w:t>
@@ -3587,7 +3917,7 @@
 </file>
 
 <file path=word/header3.xml><?xml version="1.0" encoding="utf-8"?>
-<w:hdr xmlns:wpc="http://schemas.microsoft.com/office/word/2010/wordprocessingCanvas" xmlns:cx="http://schemas.microsoft.com/office/drawing/2014/chartex" xmlns:cx1="http://schemas.microsoft.com/office/drawing/2015/9/8/chartex" xmlns:cx2="http://schemas.microsoft.com/office/drawing/2015/10/21/chartex" xmlns:cx3="http://schemas.microsoft.com/office/drawing/2016/5/9/chartex" xmlns:cx4="http://schemas.microsoft.com/office/drawing/2016/5/10/chartex" xmlns:cx5="http://schemas.microsoft.com/office/drawing/2016/5/11/chartex" xmlns:cx6="http://schemas.microsoft.com/office/drawing/2016/5/12/chartex" xmlns:cx7="http://schemas.microsoft.com/office/drawing/2016/5/13/chartex" xmlns:cx8="http://schemas.microsoft.com/office/drawing/2016/5/14/chartex" xmlns:mc="http://schemas.openxmlformats.org/markup-compatibility/2006" xmlns:aink="http://schemas.microsoft.com/office/drawing/2016/ink" xmlns:am3d="http://schemas.microsoft.com/office/drawing/2017/model3d" xmlns:o="urn:schemas-microsoft-com:office:office" xmlns:oel="http://schemas.microsoft.com/office/2019/extlst" xmlns:r="http://schemas.openxmlformats.org/officeDocument/2006/relationships" xmlns:m="http://schemas.openxmlformats.org/officeDocument/2006/math" xmlns:v="urn:schemas-microsoft-com:vml" xmlns:wp14="http://schemas.microsoft.com/office/word/2010/wordprocessingDrawing" xmlns:wp="http://schemas.openxmlformats.org/drawingml/2006/wordprocessingDrawing" xmlns:w10="urn:schemas-microsoft-com:office:word" xmlns:w="http://schemas.openxmlformats.org/wordprocessingml/2006/main" xmlns:w14="http://schemas.microsoft.com/office/word/2010/wordml" xmlns:w15="http://schemas.microsoft.com/office/word/2012/wordml" xmlns:w16cex="http://schemas.microsoft.com/office/word/2018/wordml/cex" xmlns:w16cid="http://schemas.microsoft.com/office/word/2016/wordml/cid" xmlns:w16="http://schemas.microsoft.com/office/word/2018/wordml" xmlns:w16du="http://schemas.microsoft.com/office/word/2023/wordml/word16du" xmlns:w16sdtdh="http://schemas.microsoft.com/office/word/2020/wordml/sdtdatahash" xmlns:w16sdtfl="http://schemas.microsoft.com/office/word/2024/wordml/sdtformatlock" xmlns:w16se="http://schemas.microsoft.com/office/word/2015/wordml/symex" xmlns:wpg="http://schemas.microsoft.com/office/word/2010/wordprocessingGroup" xmlns:wpi="http://schemas.microsoft.com/office/word/2010/wordprocessingInk" xmlns:wne="http://schemas.microsoft.com/office/word/2006/wordml" xmlns:wps="http://schemas.microsoft.com/office/word/2010/wordprocessingShape" mc:Ignorable="w14 w15 w16se w16cid w16 w16cex w16sdtdh w16sdtfl w16du wp14">
+<w:hdr xmlns:wpc="http://schemas.microsoft.com/office/word/2010/wordprocessingCanvas" xmlns:cx="http://schemas.microsoft.com/office/drawing/2014/chartex" xmlns:cx1="http://schemas.microsoft.com/office/drawing/2015/9/8/chartex" xmlns:cx2="http://schemas.microsoft.com/office/drawing/2015/10/21/chartex" xmlns:cx3="http://schemas.microsoft.com/office/drawing/2016/5/9/chartex" xmlns:cx4="http://schemas.microsoft.com/office/drawing/2016/5/10/chartex" xmlns:cx5="http://schemas.microsoft.com/office/drawing/2016/5/11/chartex" xmlns:cx6="http://schemas.microsoft.com/office/drawing/2016/5/12/chartex" xmlns:cx7="http://schemas.microsoft.com/office/drawing/2016/5/13/chartex" xmlns:cx8="http://schemas.microsoft.com/office/drawing/2016/5/14/chartex" xmlns:mc="http://schemas.openxmlformats.org/markup-compatibility/2006" xmlns:aink="http://schemas.microsoft.com/office/drawing/2016/ink" xmlns:am3d="http://schemas.microsoft.com/office/drawing/2017/model3d" xmlns:o="urn:schemas-microsoft-com:office:office" xmlns:oel="http://schemas.microsoft.com/office/2019/extlst" xmlns:r="http://schemas.openxmlformats.org/officeDocument/2006/relationships" xmlns:m="http://schemas.openxmlformats.org/officeDocument/2006/math" xmlns:v="urn:schemas-microsoft-com:vml" xmlns:wp14="http://schemas.microsoft.com/office/word/2010/wordprocessingDrawing" xmlns:wp="http://schemas.openxmlformats.org/drawingml/2006/wordprocessingDrawing" xmlns:w10="urn:schemas-microsoft-com:office:word" xmlns:w="http://schemas.openxmlformats.org/wordprocessingml/2006/main" xmlns:w14="http://schemas.microsoft.com/office/word/2010/wordml" xmlns:w15="http://schemas.microsoft.com/office/word/2012/wordml" xmlns:w16cei="http://schemas.microsoft.com/office/word/2026/wordml/cei" xmlns:w16cex="http://schemas.microsoft.com/office/word/2018/wordml/cex" xmlns:w16cid="http://schemas.microsoft.com/office/word/2016/wordml/cid" xmlns:w16="http://schemas.microsoft.com/office/word/2018/wordml" xmlns:w16du="http://schemas.microsoft.com/office/word/2023/wordml/word16du" xmlns:w16sdtdh="http://schemas.microsoft.com/office/word/2020/wordml/sdtdatahash" xmlns:w16sdtfl="http://schemas.microsoft.com/office/word/2024/wordml/sdtformatlock" xmlns:w16se="http://schemas.microsoft.com/office/word/2015/wordml/symex" xmlns:wpg="http://schemas.microsoft.com/office/word/2010/wordprocessingGroup" xmlns:wpi="http://schemas.microsoft.com/office/word/2010/wordprocessingInk" xmlns:wne="http://schemas.microsoft.com/office/word/2006/wordml" xmlns:wps="http://schemas.microsoft.com/office/word/2010/wordprocessingShape" mc:Ignorable="w14 w15 w16se w16cid w16 w16cex w16sdtdh w16sdtfl w16du wp14">
   <w:p>
     <w:pPr>
       <w:pStyle w:val="Header"/>
@@ -3597,7 +3927,7 @@
 </file>
 
 <file path=word/numbering.xml><?xml version="1.0" encoding="utf-8"?>
-<w:numbering xmlns:wpc="http://schemas.microsoft.com/office/word/2010/wordprocessingCanvas" xmlns:cx="http://schemas.microsoft.com/office/drawing/2014/chartex" xmlns:cx1="http://schemas.microsoft.com/office/drawing/2015/9/8/chartex" xmlns:cx2="http://schemas.microsoft.com/office/drawing/2015/10/21/chartex" xmlns:cx3="http://schemas.microsoft.com/office/drawing/2016/5/9/chartex" xmlns:cx4="http://schemas.microsoft.com/office/drawing/2016/5/10/chartex" xmlns:cx5="http://schemas.microsoft.com/office/drawing/2016/5/11/chartex" xmlns:cx6="http://schemas.microsoft.com/office/drawing/2016/5/12/chartex" xmlns:cx7="http://schemas.microsoft.com/office/drawing/2016/5/13/chartex" xmlns:cx8="http://schemas.microsoft.com/office/drawing/2016/5/14/chartex" xmlns:mc="http://schemas.openxmlformats.org/markup-compatibility/2006" xmlns:aink="http://schemas.microsoft.com/office/drawing/2016/ink" xmlns:am3d="http://schemas.microsoft.com/office/drawing/2017/model3d" xmlns:o="urn:schemas-microsoft-com:office:office" xmlns:oel="http://schemas.microsoft.com/office/2019/extlst" xmlns:r="http://schemas.openxmlformats.org/officeDocument/2006/relationships" xmlns:m="http://schemas.openxmlformats.org/officeDocument/2006/math" xmlns:v="urn:schemas-microsoft-com:vml" xmlns:wp14="http://schemas.microsoft.com/office/word/2010/wordprocessingDrawing" xmlns:wp="http://schemas.openxmlformats.org/drawingml/2006/wordprocessingDrawing" xmlns:w10="urn:schemas-microsoft-com:office:word" xmlns:w="http://schemas.openxmlformats.org/wordprocessingml/2006/main" xmlns:w14="http://schemas.microsoft.com/office/word/2010/wordml" xmlns:w15="http://schemas.microsoft.com/office/word/2012/wordml" xmlns:w16cex="http://schemas.microsoft.com/office/word/2018/wordml/cex" xmlns:w16cid="http://schemas.microsoft.com/office/word/2016/wordml/cid" xmlns:w16="http://schemas.microsoft.com/office/word/2018/wordml" xmlns:w16du="http://schemas.microsoft.com/office/word/2023/wordml/word16du" xmlns:w16sdtdh="http://schemas.microsoft.com/office/word/2020/wordml/sdtdatahash" xmlns:w16sdtfl="http://schemas.microsoft.com/office/word/2024/wordml/sdtformatlock" xmlns:w16se="http://schemas.microsoft.com/office/word/2015/wordml/symex" xmlns:wpg="http://schemas.microsoft.com/office/word/2010/wordprocessingGroup" xmlns:wpi="http://schemas.microsoft.com/office/word/2010/wordprocessingInk" xmlns:wne="http://schemas.microsoft.com/office/word/2006/wordml" xmlns:wps="http://schemas.microsoft.com/office/word/2010/wordprocessingShape" mc:Ignorable="w14 w15 w16se w16cid w16 w16cex w16sdtdh w16sdtfl w16du wp14">
+<w:numbering xmlns:wpc="http://schemas.microsoft.com/office/word/2010/wordprocessingCanvas" xmlns:cx="http://schemas.microsoft.com/office/drawing/2014/chartex" xmlns:cx1="http://schemas.microsoft.com/office/drawing/2015/9/8/chartex" xmlns:cx2="http://schemas.microsoft.com/office/drawing/2015/10/21/chartex" xmlns:cx3="http://schemas.microsoft.com/office/drawing/2016/5/9/chartex" xmlns:cx4="http://schemas.microsoft.com/office/drawing/2016/5/10/chartex" xmlns:cx5="http://schemas.microsoft.com/office/drawing/2016/5/11/chartex" xmlns:cx6="http://schemas.microsoft.com/office/drawing/2016/5/12/chartex" xmlns:cx7="http://schemas.microsoft.com/office/drawing/2016/5/13/chartex" xmlns:cx8="http://schemas.microsoft.com/office/drawing/2016/5/14/chartex" xmlns:mc="http://schemas.openxmlformats.org/markup-compatibility/2006" xmlns:aink="http://schemas.microsoft.com/office/drawing/2016/ink" xmlns:am3d="http://schemas.microsoft.com/office/drawing/2017/model3d" xmlns:o="urn:schemas-microsoft-com:office:office" xmlns:oel="http://schemas.microsoft.com/office/2019/extlst" xmlns:r="http://schemas.openxmlformats.org/officeDocument/2006/relationships" xmlns:m="http://schemas.openxmlformats.org/officeDocument/2006/math" xmlns:v="urn:schemas-microsoft-com:vml" xmlns:wp14="http://schemas.microsoft.com/office/word/2010/wordprocessingDrawing" xmlns:wp="http://schemas.openxmlformats.org/drawingml/2006/wordprocessingDrawing" xmlns:w10="urn:schemas-microsoft-com:office:word" xmlns:w="http://schemas.openxmlformats.org/wordprocessingml/2006/main" xmlns:w14="http://schemas.microsoft.com/office/word/2010/wordml" xmlns:w15="http://schemas.microsoft.com/office/word/2012/wordml" xmlns:w16cei="http://schemas.microsoft.com/office/word/2026/wordml/cei" xmlns:w16cex="http://schemas.microsoft.com/office/word/2018/wordml/cex" xmlns:w16cid="http://schemas.microsoft.com/office/word/2016/wordml/cid" xmlns:w16="http://schemas.microsoft.com/office/word/2018/wordml" xmlns:w16du="http://schemas.microsoft.com/office/word/2023/wordml/word16du" xmlns:w16sdtdh="http://schemas.microsoft.com/office/word/2020/wordml/sdtdatahash" xmlns:w16sdtfl="http://schemas.microsoft.com/office/word/2024/wordml/sdtformatlock" xmlns:w16se="http://schemas.microsoft.com/office/word/2015/wordml/symex" xmlns:wpg="http://schemas.microsoft.com/office/word/2010/wordprocessingGroup" xmlns:wpi="http://schemas.microsoft.com/office/word/2010/wordprocessingInk" xmlns:wne="http://schemas.microsoft.com/office/word/2006/wordml" xmlns:wps="http://schemas.microsoft.com/office/word/2010/wordprocessingShape" mc:Ignorable="w14 w15 w16se w16cid w16 w16cex w16sdtdh w16sdtfl w16du wp14">
   <w:abstractNum w:abstractNumId="0" w15:restartNumberingAfterBreak="0">
     <w:nsid w:val="02077C83"/>
     <w:multiLevelType w:val="hybridMultilevel"/>
@@ -4576,6 +4906,119 @@
     </w:lvl>
   </w:abstractNum>
   <w:abstractNum w:abstractNumId="8" w15:restartNumberingAfterBreak="0">
+    <w:nsid w:val="41FF0449"/>
+    <w:multiLevelType w:val="hybridMultilevel"/>
+    <w:tmpl w:val="4AF02C6A"/>
+    <w:lvl w:ilvl="0" w:tplc="04090001">
+      <w:start w:val="1"/>
+      <w:numFmt w:val="bullet"/>
+      <w:lvlText w:val=""/>
+      <w:lvlJc w:val="left"/>
+      <w:pPr>
+        <w:ind w:left="720" w:hanging="360"/>
+      </w:pPr>
+      <w:rPr>
+        <w:rFonts w:ascii="Symbol" w:hAnsi="Symbol" w:hint="default"/>
+      </w:rPr>
+    </w:lvl>
+    <w:lvl w:ilvl="1" w:tplc="04090003">
+      <w:start w:val="1"/>
+      <w:numFmt w:val="bullet"/>
+      <w:lvlText w:val="o"/>
+      <w:lvlJc w:val="left"/>
+      <w:pPr>
+        <w:ind w:left="1440" w:hanging="360"/>
+      </w:pPr>
+      <w:rPr>
+        <w:rFonts w:ascii="Courier New" w:hAnsi="Courier New" w:cs="Courier New" w:hint="default"/>
+      </w:rPr>
+    </w:lvl>
+    <w:lvl w:ilvl="2" w:tplc="04090005" w:tentative="1">
+      <w:start w:val="1"/>
+      <w:numFmt w:val="bullet"/>
+      <w:lvlText w:val=""/>
+      <w:lvlJc w:val="left"/>
+      <w:pPr>
+        <w:ind w:left="2160" w:hanging="360"/>
+      </w:pPr>
+      <w:rPr>
+        <w:rFonts w:ascii="Wingdings" w:hAnsi="Wingdings" w:hint="default"/>
+      </w:rPr>
+    </w:lvl>
+    <w:lvl w:ilvl="3" w:tplc="04090001" w:tentative="1">
+      <w:start w:val="1"/>
+      <w:numFmt w:val="bullet"/>
+      <w:lvlText w:val=""/>
+      <w:lvlJc w:val="left"/>
+      <w:pPr>
+        <w:ind w:left="2880" w:hanging="360"/>
+      </w:pPr>
+      <w:rPr>
+        <w:rFonts w:ascii="Symbol" w:hAnsi="Symbol" w:hint="default"/>
+      </w:rPr>
+    </w:lvl>
+    <w:lvl w:ilvl="4" w:tplc="04090003" w:tentative="1">
+      <w:start w:val="1"/>
+      <w:numFmt w:val="bullet"/>
+      <w:lvlText w:val="o"/>
+      <w:lvlJc w:val="left"/>
+      <w:pPr>
+        <w:ind w:left="3600" w:hanging="360"/>
+      </w:pPr>
+      <w:rPr>
+        <w:rFonts w:ascii="Courier New" w:hAnsi="Courier New" w:cs="Courier New" w:hint="default"/>
+      </w:rPr>
+    </w:lvl>
+    <w:lvl w:ilvl="5" w:tplc="04090005" w:tentative="1">
+      <w:start w:val="1"/>
+      <w:numFmt w:val="bullet"/>
+      <w:lvlText w:val=""/>
+      <w:lvlJc w:val="left"/>
+      <w:pPr>
+        <w:ind w:left="4320" w:hanging="360"/>
+      </w:pPr>
+      <w:rPr>
+        <w:rFonts w:ascii="Wingdings" w:hAnsi="Wingdings" w:hint="default"/>
+      </w:rPr>
+    </w:lvl>
+    <w:lvl w:ilvl="6" w:tplc="04090001" w:tentative="1">
+      <w:start w:val="1"/>
+      <w:numFmt w:val="bullet"/>
+      <w:lvlText w:val=""/>
+      <w:lvlJc w:val="left"/>
+      <w:pPr>
+        <w:ind w:left="5040" w:hanging="360"/>
+      </w:pPr>
+      <w:rPr>
+        <w:rFonts w:ascii="Symbol" w:hAnsi="Symbol" w:hint="default"/>
+      </w:rPr>
+    </w:lvl>
+    <w:lvl w:ilvl="7" w:tplc="04090003" w:tentative="1">
+      <w:start w:val="1"/>
+      <w:numFmt w:val="bullet"/>
+      <w:lvlText w:val="o"/>
+      <w:lvlJc w:val="left"/>
+      <w:pPr>
+        <w:ind w:left="5760" w:hanging="360"/>
+      </w:pPr>
+      <w:rPr>
+        <w:rFonts w:ascii="Courier New" w:hAnsi="Courier New" w:cs="Courier New" w:hint="default"/>
+      </w:rPr>
+    </w:lvl>
+    <w:lvl w:ilvl="8" w:tplc="04090005" w:tentative="1">
+      <w:start w:val="1"/>
+      <w:numFmt w:val="bullet"/>
+      <w:lvlText w:val=""/>
+      <w:lvlJc w:val="left"/>
+      <w:pPr>
+        <w:ind w:left="6480" w:hanging="360"/>
+      </w:pPr>
+      <w:rPr>
+        <w:rFonts w:ascii="Wingdings" w:hAnsi="Wingdings" w:hint="default"/>
+      </w:rPr>
+    </w:lvl>
+  </w:abstractNum>
+  <w:abstractNum w:abstractNumId="9" w15:restartNumberingAfterBreak="0">
     <w:nsid w:val="48EB2315"/>
     <w:multiLevelType w:val="hybridMultilevel"/>
     <w:tmpl w:val="04F44D4A"/>
@@ -4688,7 +5131,7 @@
       </w:rPr>
     </w:lvl>
   </w:abstractNum>
-  <w:abstractNum w:abstractNumId="9" w15:restartNumberingAfterBreak="0">
+  <w:abstractNum w:abstractNumId="10" w15:restartNumberingAfterBreak="0">
     <w:nsid w:val="514476B8"/>
     <w:multiLevelType w:val="hybridMultilevel"/>
     <w:tmpl w:val="9CC816C8"/>
@@ -4801,7 +5244,7 @@
       </w:rPr>
     </w:lvl>
   </w:abstractNum>
-  <w:abstractNum w:abstractNumId="10" w15:restartNumberingAfterBreak="0">
+  <w:abstractNum w:abstractNumId="11" w15:restartNumberingAfterBreak="0">
     <w:nsid w:val="6D6057E7"/>
     <w:multiLevelType w:val="hybridMultilevel"/>
     <w:tmpl w:val="00D42D8C"/>
@@ -4914,7 +5357,7 @@
       </w:rPr>
     </w:lvl>
   </w:abstractNum>
-  <w:abstractNum w:abstractNumId="11" w15:restartNumberingAfterBreak="0">
+  <w:abstractNum w:abstractNumId="12" w15:restartNumberingAfterBreak="0">
     <w:nsid w:val="797B32D5"/>
     <w:multiLevelType w:val="hybridMultilevel"/>
     <w:tmpl w:val="BED462E2"/>
@@ -5027,7 +5470,7 @@
       </w:rPr>
     </w:lvl>
   </w:abstractNum>
-  <w:abstractNum w:abstractNumId="12" w15:restartNumberingAfterBreak="0">
+  <w:abstractNum w:abstractNumId="13" w15:restartNumberingAfterBreak="0">
     <w:nsid w:val="7AB2526F"/>
     <w:multiLevelType w:val="hybridMultilevel"/>
     <w:tmpl w:val="6E0A0CFA"/>
@@ -5156,22 +5599,22 @@
     <w:abstractNumId w:val="1"/>
   </w:num>
   <w:num w:numId="6" w16cid:durableId="474837087">
-    <w:abstractNumId w:val="8"/>
+    <w:abstractNumId w:val="9"/>
   </w:num>
   <w:num w:numId="7" w16cid:durableId="728577313">
-    <w:abstractNumId w:val="11"/>
+    <w:abstractNumId w:val="12"/>
   </w:num>
   <w:num w:numId="8" w16cid:durableId="1916360191">
-    <w:abstractNumId w:val="9"/>
+    <w:abstractNumId w:val="10"/>
   </w:num>
   <w:num w:numId="9" w16cid:durableId="923228084">
-    <w:abstractNumId w:val="10"/>
+    <w:abstractNumId w:val="11"/>
   </w:num>
   <w:num w:numId="10" w16cid:durableId="1852647987">
     <w:abstractNumId w:val="6"/>
   </w:num>
   <w:num w:numId="11" w16cid:durableId="610019143">
-    <w:abstractNumId w:val="12"/>
+    <w:abstractNumId w:val="13"/>
   </w:num>
   <w:num w:numId="12" w16cid:durableId="1141845712">
     <w:abstractNumId w:val="5"/>
@@ -5212,6 +5655,9 @@
         </w:rPr>
       </w:lvl>
     </w:lvlOverride>
+  </w:num>
+  <w:num w:numId="14" w16cid:durableId="2130737288">
+    <w:abstractNumId w:val="8"/>
   </w:num>
 </w:numbering>
 </file>
@@ -5641,7 +6087,6 @@
   <w:style w:type="character" w:default="1" w:styleId="DefaultParagraphFont">
     <w:name w:val="Default Paragraph Font"/>
     <w:uiPriority w:val="1"/>
-    <w:semiHidden/>
     <w:unhideWhenUsed/>
   </w:style>
   <w:style w:type="table" w:default="1" w:styleId="TableNormal">

</xml_diff>